<commit_message>
specified architecture + added temporary  flow key valid hold
</commit_message>
<xml_diff>
--- a/docs/Zynq Networking Dataplane Specifications.docx
+++ b/docs/Zynq Networking Dataplane Specifications.docx
@@ -189,7 +189,6 @@
             <w:pPr>
               <w:pStyle w:val="Normal"/>
               <w:widowControl w:val="false"/>
-              <w:pBdr/>
               <w:spacing w:lineRule="auto" w:line="240"/>
               <w:rPr>
                 <w:rFonts w:ascii="Times New Roman" w:hAnsi="Times New Roman" w:cs="Times New Roman"/>
@@ -228,7 +227,6 @@
             <w:pPr>
               <w:pStyle w:val="Normal"/>
               <w:widowControl w:val="false"/>
-              <w:pBdr/>
               <w:spacing w:lineRule="auto" w:line="240"/>
               <w:rPr>
                 <w:rFonts w:ascii="Times New Roman" w:hAnsi="Times New Roman" w:cs="Times New Roman"/>
@@ -267,7 +265,6 @@
             <w:pPr>
               <w:pStyle w:val="Normal"/>
               <w:widowControl w:val="false"/>
-              <w:pBdr/>
               <w:spacing w:lineRule="auto" w:line="240"/>
               <w:rPr>
                 <w:rFonts w:ascii="Times New Roman" w:hAnsi="Times New Roman" w:cs="Times New Roman"/>
@@ -306,7 +303,6 @@
             <w:pPr>
               <w:pStyle w:val="Normal"/>
               <w:widowControl w:val="false"/>
-              <w:pBdr/>
               <w:spacing w:lineRule="auto" w:line="240"/>
               <w:rPr>
                 <w:rFonts w:ascii="Times New Roman" w:hAnsi="Times New Roman" w:cs="Times New Roman"/>
@@ -348,7 +344,6 @@
             <w:pPr>
               <w:pStyle w:val="Normal"/>
               <w:widowControl w:val="false"/>
-              <w:pBdr/>
               <w:spacing w:lineRule="auto" w:line="240"/>
               <w:rPr>
                 <w:rFonts w:ascii="Times New Roman" w:hAnsi="Times New Roman" w:cs="Times New Roman"/>
@@ -381,7 +376,6 @@
             <w:pPr>
               <w:pStyle w:val="Normal"/>
               <w:widowControl w:val="false"/>
-              <w:pBdr/>
               <w:spacing w:lineRule="auto" w:line="240"/>
               <w:rPr>
                 <w:rFonts w:ascii="Times New Roman" w:hAnsi="Times New Roman" w:cs="Times New Roman"/>
@@ -414,7 +408,6 @@
             <w:pPr>
               <w:pStyle w:val="Normal"/>
               <w:widowControl w:val="false"/>
-              <w:pBdr/>
               <w:spacing w:lineRule="auto" w:line="240"/>
               <w:rPr>
                 <w:rFonts w:ascii="Times New Roman" w:hAnsi="Times New Roman" w:cs="Times New Roman"/>
@@ -447,7 +440,6 @@
             <w:pPr>
               <w:pStyle w:val="Normal"/>
               <w:widowControl w:val="false"/>
-              <w:pBdr/>
               <w:spacing w:lineRule="auto" w:line="240"/>
               <w:rPr>
                 <w:rFonts w:ascii="Times New Roman" w:hAnsi="Times New Roman" w:cs="Times New Roman"/>
@@ -483,7 +475,6 @@
             <w:pPr>
               <w:pStyle w:val="Normal"/>
               <w:widowControl w:val="false"/>
-              <w:pBdr/>
               <w:spacing w:lineRule="auto" w:line="240"/>
               <w:rPr>
                 <w:rFonts w:ascii="Times New Roman" w:hAnsi="Times New Roman" w:cs="Times New Roman"/>
@@ -516,7 +507,6 @@
             <w:pPr>
               <w:pStyle w:val="Normal"/>
               <w:widowControl w:val="false"/>
-              <w:pBdr/>
               <w:spacing w:lineRule="auto" w:line="240"/>
               <w:rPr>
                 <w:rFonts w:ascii="Times New Roman" w:hAnsi="Times New Roman" w:cs="Times New Roman"/>
@@ -549,7 +539,6 @@
             <w:pPr>
               <w:pStyle w:val="Normal"/>
               <w:widowControl w:val="false"/>
-              <w:pBdr/>
               <w:spacing w:lineRule="auto" w:line="240"/>
               <w:rPr>
                 <w:rFonts w:ascii="Times New Roman" w:hAnsi="Times New Roman" w:cs="Times New Roman"/>
@@ -582,7 +571,6 @@
             <w:pPr>
               <w:pStyle w:val="Normal"/>
               <w:widowControl w:val="false"/>
-              <w:pBdr/>
               <w:spacing w:lineRule="auto" w:line="240"/>
               <w:rPr>
                 <w:rFonts w:ascii="Times New Roman" w:hAnsi="Times New Roman" w:cs="Times New Roman"/>
@@ -746,6 +734,7 @@
           <w:r>
             <w:rPr>
               <w:rStyle w:val="IndexLink"/>
+              <w:vanish w:val="false"/>
               <w:webHidden/>
               <w:lang w:val="en-US"/>
             </w:rPr>
@@ -754,6 +743,7 @@
           <w:r>
             <w:rPr>
               <w:rStyle w:val="IndexLink"/>
+              <w:vanish w:val="false"/>
               <w:webHidden/>
               <w:lang w:val="en-US"/>
             </w:rPr>
@@ -763,6 +753,7 @@
             <w:r>
               <w:rPr>
                 <w:rStyle w:val="IndexLink"/>
+                <w:vanish w:val="false"/>
                 <w:webHidden/>
                 <w:lang w:val="en-US"/>
               </w:rPr>
@@ -842,6 +833,7 @@
             <w:r>
               <w:rPr>
                 <w:rStyle w:val="IndexLink"/>
+                <w:vanish w:val="false"/>
                 <w:webHidden/>
               </w:rPr>
               <w:t>3</w:t>
@@ -919,6 +911,7 @@
             <w:r>
               <w:rPr>
                 <w:rStyle w:val="IndexLink"/>
+                <w:vanish w:val="false"/>
                 <w:webHidden/>
               </w:rPr>
               <w:t>3.1</w:t>
@@ -997,6 +990,7 @@
               <w:rPr>
                 <w:rStyle w:val="IndexLink"/>
                 <w:rFonts w:cs="Times New Roman" w:ascii="Times New Roman" w:hAnsi="Times New Roman"/>
+                <w:vanish w:val="false"/>
                 <w:webHidden/>
               </w:rPr>
               <w:t>3.1.1</w:t>
@@ -1076,6 +1070,7 @@
               <w:rPr>
                 <w:rStyle w:val="IndexLink"/>
                 <w:rFonts w:cs="Times New Roman" w:ascii="Times New Roman" w:hAnsi="Times New Roman"/>
+                <w:vanish w:val="false"/>
                 <w:webHidden/>
                 <w:lang w:val="en-US"/>
               </w:rPr>
@@ -1157,6 +1152,7 @@
               <w:rPr>
                 <w:rStyle w:val="IndexLink"/>
                 <w:rFonts w:cs="Times New Roman" w:ascii="Times New Roman" w:hAnsi="Times New Roman"/>
+                <w:vanish w:val="false"/>
                 <w:webHidden/>
                 <w:lang w:val="en-US"/>
               </w:rPr>
@@ -1238,6 +1234,7 @@
               <w:rPr>
                 <w:rStyle w:val="IndexLink"/>
                 <w:rFonts w:cs="Times New Roman" w:ascii="Times New Roman" w:hAnsi="Times New Roman"/>
+                <w:vanish w:val="false"/>
                 <w:webHidden/>
               </w:rPr>
               <w:t>3.1.4</w:t>
@@ -1317,6 +1314,7 @@
               <w:rPr>
                 <w:rStyle w:val="IndexLink"/>
                 <w:rFonts w:cs="Times New Roman" w:ascii="Times New Roman" w:hAnsi="Times New Roman"/>
+                <w:vanish w:val="false"/>
                 <w:webHidden/>
                 <w:lang w:val="en-US"/>
               </w:rPr>
@@ -1398,6 +1396,7 @@
               <w:rPr>
                 <w:rStyle w:val="IndexLink"/>
                 <w:rFonts w:cs="Times New Roman" w:ascii="Times New Roman" w:hAnsi="Times New Roman"/>
+                <w:vanish w:val="false"/>
                 <w:webHidden/>
                 <w:lang w:val="en-US"/>
               </w:rPr>
@@ -1479,6 +1478,7 @@
               <w:rPr>
                 <w:rStyle w:val="IndexLink"/>
                 <w:rFonts w:cs="Times New Roman" w:ascii="Times New Roman" w:hAnsi="Times New Roman"/>
+                <w:vanish w:val="false"/>
                 <w:webHidden/>
                 <w:lang w:val="en-US"/>
               </w:rPr>
@@ -1560,6 +1560,7 @@
               <w:rPr>
                 <w:rStyle w:val="IndexLink"/>
                 <w:rFonts w:cs="Times New Roman" w:ascii="Times New Roman" w:hAnsi="Times New Roman"/>
+                <w:vanish w:val="false"/>
                 <w:webHidden/>
                 <w:lang w:val="en-US"/>
               </w:rPr>
@@ -1641,6 +1642,7 @@
               <w:rPr>
                 <w:rStyle w:val="IndexLink"/>
                 <w:rFonts w:cs="Times New Roman" w:ascii="Times New Roman" w:hAnsi="Times New Roman"/>
+                <w:vanish w:val="false"/>
                 <w:webHidden/>
                 <w:lang w:val="en-US"/>
               </w:rPr>
@@ -1722,6 +1724,7 @@
               <w:rPr>
                 <w:rStyle w:val="IndexLink"/>
                 <w:rFonts w:cs="Times New Roman" w:ascii="Times New Roman" w:hAnsi="Times New Roman"/>
+                <w:vanish w:val="false"/>
                 <w:webHidden/>
                 <w:lang w:val="en-US"/>
               </w:rPr>
@@ -1803,6 +1806,7 @@
               <w:rPr>
                 <w:rStyle w:val="IndexLink"/>
                 <w:rFonts w:cs="Times New Roman" w:ascii="Times New Roman" w:hAnsi="Times New Roman"/>
+                <w:vanish w:val="false"/>
                 <w:webHidden/>
                 <w:lang w:val="en-US"/>
               </w:rPr>
@@ -2264,7 +2268,59 @@
           <w:bCs w:val="false"/>
           <w:lang w:val="en-US"/>
         </w:rPr>
-        <w:t>- Should action stage or other axi stream pipelining registers contain a reset signal (Causes higher fan-outs which could cause problems with timing requirements).</w:t>
+        <w:t>- Should action stage or other axi stream pipelining registers contain a reset signal (Causes higher fanouts which could cause problems with timing requirements). We can use GSR (global set/reset line) on FPGA to reduce the need for high fanout reset signal.</w:t>
+      </w:r>
+    </w:p>
+    <w:p>
+      <w:pPr>
+        <w:pStyle w:val="Normal"/>
+        <w:rPr>
+          <w:b w:val="false"/>
+          <w:bCs w:val="false"/>
+          <w:lang w:val="en-US"/>
+        </w:rPr>
+      </w:pPr>
+      <w:r>
+        <w:rPr>
+          <w:b w:val="false"/>
+          <w:bCs w:val="false"/>
+          <w:lang w:val="en-US"/>
+        </w:rPr>
+        <w:t xml:space="preserve">- </w:t>
+      </w:r>
+      <w:r>
+        <w:rPr>
+          <w:b w:val="false"/>
+          <w:bCs w:val="false"/>
+          <w:lang w:val="en-US"/>
+        </w:rPr>
+        <w:t>BRAM tables shouldn’t use reset signal also CSR doesn’t need reset since all of these are controleld by PS (we can initate all of the registers before enabling dataplane)</w:t>
+      </w:r>
+    </w:p>
+    <w:p>
+      <w:pPr>
+        <w:pStyle w:val="Normal"/>
+        <w:rPr>
+          <w:b w:val="false"/>
+          <w:bCs w:val="false"/>
+          <w:lang w:val="en-US"/>
+        </w:rPr>
+      </w:pPr>
+      <w:r>
+        <w:rPr>
+          <w:b w:val="false"/>
+          <w:bCs w:val="false"/>
+          <w:lang w:val="en-US"/>
+        </w:rPr>
+        <w:t xml:space="preserve">- </w:t>
+      </w:r>
+      <w:r>
+        <w:rPr>
+          <w:b w:val="false"/>
+          <w:bCs w:val="false"/>
+          <w:lang w:val="en-US"/>
+        </w:rPr>
+        <w:t>We should adda dp_start set/clear CSR that enables the dataplane (can be used for example after all of the tables / CSR’s have been initialized)</w:t>
       </w:r>
     </w:p>
     <w:p>
@@ -2554,6 +2610,7 @@
             <w:pPr>
               <w:pStyle w:val="Normal"/>
               <w:widowControl/>
+              <w:suppressAutoHyphens w:val="true"/>
               <w:spacing w:lineRule="auto" w:line="240" w:before="0" w:after="0"/>
               <w:jc w:val="center"/>
               <w:rPr>
@@ -2589,6 +2646,7 @@
             <w:pPr>
               <w:pStyle w:val="Normal"/>
               <w:widowControl/>
+              <w:suppressAutoHyphens w:val="true"/>
               <w:spacing w:lineRule="auto" w:line="240" w:before="0" w:after="0"/>
               <w:jc w:val="center"/>
               <w:rPr>
@@ -2626,6 +2684,7 @@
             <w:pPr>
               <w:pStyle w:val="Normal"/>
               <w:widowControl/>
+              <w:suppressAutoHyphens w:val="true"/>
               <w:spacing w:lineRule="auto" w:line="240" w:before="0" w:after="0"/>
               <w:jc w:val="center"/>
               <w:rPr>
@@ -2656,6 +2715,7 @@
             <w:pPr>
               <w:pStyle w:val="Normal"/>
               <w:widowControl/>
+              <w:suppressAutoHyphens w:val="true"/>
               <w:spacing w:lineRule="auto" w:line="240" w:before="0" w:after="0"/>
               <w:jc w:val="center"/>
               <w:rPr>
@@ -2689,6 +2749,7 @@
             <w:pPr>
               <w:pStyle w:val="Normal"/>
               <w:widowControl/>
+              <w:suppressAutoHyphens w:val="true"/>
               <w:spacing w:lineRule="auto" w:line="240" w:before="0" w:after="0"/>
               <w:jc w:val="center"/>
               <w:rPr>
@@ -2719,6 +2780,7 @@
             <w:pPr>
               <w:pStyle w:val="Normal"/>
               <w:widowControl/>
+              <w:suppressAutoHyphens w:val="true"/>
               <w:spacing w:lineRule="auto" w:line="240" w:before="0" w:after="0"/>
               <w:jc w:val="center"/>
               <w:rPr>
@@ -2752,6 +2814,7 @@
             <w:pPr>
               <w:pStyle w:val="Normal"/>
               <w:widowControl/>
+              <w:suppressAutoHyphens w:val="true"/>
               <w:spacing w:lineRule="auto" w:line="240" w:before="0" w:after="0"/>
               <w:jc w:val="center"/>
               <w:rPr>
@@ -2782,6 +2845,7 @@
             <w:pPr>
               <w:pStyle w:val="Normal"/>
               <w:widowControl/>
+              <w:suppressAutoHyphens w:val="true"/>
               <w:spacing w:lineRule="auto" w:line="240" w:before="0" w:after="0"/>
               <w:jc w:val="center"/>
               <w:rPr>
@@ -3306,7 +3370,6 @@
           <w:pPr>
             <w:pStyle w:val="Normal"/>
             <w:widowControl w:val="false"/>
-            <w:pBdr/>
             <w:spacing w:lineRule="auto" w:line="240"/>
             <w:rPr/>
           </w:pPr>
@@ -3357,7 +3420,6 @@
           <w:pPr>
             <w:pStyle w:val="Normal"/>
             <w:widowControl w:val="false"/>
-            <w:pBdr/>
             <w:spacing w:lineRule="auto" w:line="240"/>
             <w:rPr/>
           </w:pPr>
@@ -3381,7 +3443,6 @@
           <w:pPr>
             <w:pStyle w:val="Normal"/>
             <w:widowControl w:val="false"/>
-            <w:pBdr/>
             <w:spacing w:lineRule="auto" w:line="240"/>
             <w:jc w:val="end"/>
             <w:rPr/>
@@ -3401,82 +3462,54 @@
     </w:pPr>
     <w:r>
       <w:rPr/>
-      <mc:AlternateContent>
-        <mc:Choice Requires="wps">
-          <w:drawing>
-            <wp:anchor distT="0" distB="0" distL="0" distR="0" simplePos="0" relativeHeight="11" behindDoc="1" locked="0" layoutInCell="0" allowOverlap="1">
-              <wp:simplePos x="0" y="0"/>
-              <wp:positionH relativeFrom="margin">
-                <wp:align>center</wp:align>
-              </wp:positionH>
-              <wp:positionV relativeFrom="margin">
-                <wp:align>center</wp:align>
-              </wp:positionV>
-              <wp:extent cx="5731510" cy="3820795"/>
-              <wp:effectExtent l="0" t="0" r="0" b="0"/>
-              <wp:wrapNone/>
-              <wp:docPr id="2" name="WordPictureWatermark1"/>
-              <a:graphic xmlns:a="http://schemas.openxmlformats.org/drawingml/2006/main">
-                <a:graphicData uri="http://schemas.openxmlformats.org/drawingml/2006/picture">
-                  <pic:pic xmlns:pic="http://schemas.openxmlformats.org/drawingml/2006/picture">
-                    <pic:nvPicPr>
-                      <pic:cNvPr id="3" name="WordPictureWatermark1"/>
-                      <pic:cNvPicPr/>
-                    </pic:nvPicPr>
-                    <pic:blipFill>
-                      <a:blip r:embed="rId1">
-                        <a:lum bright="70000" contrast="-70000"/>
-                      </a:blip>
-                      <a:stretch/>
-                    </pic:blipFill>
-                    <pic:spPr>
-                      <a:xfrm>
-                        <a:off x="0" y="0"/>
-                        <a:ext cx="5731560" cy="3820680"/>
-                      </a:xfrm>
-                      <a:prstGeom prst="rect">
-                        <a:avLst/>
-                      </a:prstGeom>
-                      <a:noFill/>
-                      <a:ln w="0">
-                        <a:noFill/>
-                      </a:ln>
-                    </pic:spPr>
-                  </pic:pic>
-                </a:graphicData>
-              </a:graphic>
-            </wp:anchor>
-          </w:drawing>
-        </mc:Choice>
-        <mc:Fallback>
-          <w:pict>
-            <v:shapetype id="_x0000_t75" coordsize="21600,21600" o:spt="75" o:preferrelative="t" path="m@4@5l@4@11@9@11@9@5xe" filled="f" stroked="f">
-              <v:stroke joinstyle="miter"/>
-              <v:formulas>
-                <v:f eqn="if lineDrawn pixelLineWidth 0"/>
-                <v:f eqn="sum @0 1 0"/>
-                <v:f eqn="sum 0 0 @1"/>
-                <v:f eqn="prod @2 1 2"/>
-                <v:f eqn="prod @3 21600 pixelWidth"/>
-                <v:f eqn="prod @3 21600 pixelHeight"/>
-                <v:f eqn="sum @0 0 1"/>
-                <v:f eqn="prod @6 1 2"/>
-                <v:f eqn="prod @7 21600 pixelWidth"/>
-                <v:f eqn="sum @8 21600 0"/>
-                <v:f eqn="prod @7 21600 pixelHeight"/>
-                <v:f eqn="sum @10 21600 0"/>
-              </v:formulas>
-              <v:path o:extrusionok="f" gradientshapeok="t" o:connecttype="rect"/>
-              <o:lock v:ext="edit" aspectratio="t"/>
-            </v:shapetype>
-            <v:shape id="WordPictureWatermark1" o:spid="shape_0" stroked="f" o:allowincell="f" style="position:absolute;margin-left:0pt;margin-top:177.85pt;width:451.25pt;height:300.8pt;mso-wrap-style:none;v-text-anchor:middle;mso-position-horizontal:center;mso-position-horizontal-relative:margin;mso-position-vertical:center;mso-position-vertical-relative:margin" type="_x0000_t75">
-              <v:imagedata r:id="rId2" o:detectmouseclick="t"/>
-              <v:stroke color="#3465a4" joinstyle="round" endcap="flat"/>
-              <w10:wrap type="none"/>
-            </v:shape>
-          </w:pict>
-        </mc:Fallback>
-      </mc:AlternateContent>
+      <w:drawing>
+        <wp:anchor distT="0" distB="0" distL="0" distR="0" simplePos="0" relativeHeight="11" behindDoc="1" locked="0" layoutInCell="0" allowOverlap="1">
+          <wp:simplePos x="0" y="0"/>
+          <wp:positionH relativeFrom="margin">
+            <wp:align>center</wp:align>
+          </wp:positionH>
+          <wp:positionV relativeFrom="margin">
+            <wp:align>center</wp:align>
+          </wp:positionV>
+          <wp:extent cx="5731510" cy="3820795"/>
+          <wp:effectExtent l="0" t="0" r="0" b="0"/>
+          <wp:wrapNone/>
+          <wp:docPr id="2" name="WordPictureWatermark1"/>
+          <wp:cNvGraphicFramePr>
+            <a:graphicFrameLocks xmlns:a="http://schemas.openxmlformats.org/drawingml/2006/main" noChangeAspect="1"/>
+          </wp:cNvGraphicFramePr>
+          <a:graphic xmlns:a="http://schemas.openxmlformats.org/drawingml/2006/main">
+            <a:graphicData uri="http://schemas.openxmlformats.org/drawingml/2006/picture">
+              <pic:pic xmlns:pic="http://schemas.openxmlformats.org/drawingml/2006/picture">
+                <pic:nvPicPr>
+                  <pic:cNvPr id="2" name="WordPictureWatermark1"/>
+                  <pic:cNvPicPr>
+                    <a:picLocks noChangeAspect="1" noChangeArrowheads="1"/>
+                  </pic:cNvPicPr>
+                </pic:nvPicPr>
+                <pic:blipFill>
+                  <a:blip r:embed="rId1">
+                    <a:lum bright="70000" contrast="-70000"/>
+                  </a:blip>
+                  <a:stretch>
+                    <a:fillRect/>
+                  </a:stretch>
+                </pic:blipFill>
+                <pic:spPr bwMode="auto">
+                  <a:xfrm>
+                    <a:off x="0" y="0"/>
+                    <a:ext cx="5731510" cy="3820795"/>
+                  </a:xfrm>
+                  <a:prstGeom prst="rect">
+                    <a:avLst/>
+                  </a:prstGeom>
+                  <a:noFill/>
+                </pic:spPr>
+              </pic:pic>
+            </a:graphicData>
+          </a:graphic>
+        </wp:anchor>
+      </w:drawing>
     </w:r>
   </w:p>
 </w:hdr>
@@ -3528,7 +3561,6 @@
           <w:pPr>
             <w:pStyle w:val="Normal"/>
             <w:widowControl w:val="false"/>
-            <w:pBdr/>
             <w:spacing w:lineRule="auto" w:line="240"/>
             <w:rPr/>
           </w:pPr>
@@ -3579,7 +3611,6 @@
           <w:pPr>
             <w:pStyle w:val="Normal"/>
             <w:widowControl w:val="false"/>
-            <w:pBdr/>
             <w:spacing w:lineRule="auto" w:line="240"/>
             <w:rPr/>
           </w:pPr>
@@ -3603,7 +3634,6 @@
           <w:pPr>
             <w:pStyle w:val="Normal"/>
             <w:widowControl w:val="false"/>
-            <w:pBdr/>
             <w:spacing w:lineRule="auto" w:line="240"/>
             <w:jc w:val="end"/>
             <w:rPr/>
@@ -3623,63 +3653,54 @@
     </w:pPr>
     <w:r>
       <w:rPr/>
-      <mc:AlternateContent>
-        <mc:Choice Requires="wps">
-          <w:drawing>
-            <wp:anchor distT="0" distB="0" distL="0" distR="0" simplePos="0" relativeHeight="11" behindDoc="1" locked="0" layoutInCell="0" allowOverlap="1">
-              <wp:simplePos x="0" y="0"/>
-              <wp:positionH relativeFrom="margin">
-                <wp:align>center</wp:align>
-              </wp:positionH>
-              <wp:positionV relativeFrom="margin">
-                <wp:align>center</wp:align>
-              </wp:positionV>
-              <wp:extent cx="5731510" cy="3820795"/>
-              <wp:effectExtent l="0" t="0" r="0" b="0"/>
-              <wp:wrapNone/>
-              <wp:docPr id="4" name="WordPictureWatermark1"/>
-              <a:graphic xmlns:a="http://schemas.openxmlformats.org/drawingml/2006/main">
-                <a:graphicData uri="http://schemas.openxmlformats.org/drawingml/2006/picture">
-                  <pic:pic xmlns:pic="http://schemas.openxmlformats.org/drawingml/2006/picture">
-                    <pic:nvPicPr>
-                      <pic:cNvPr id="5" name="WordPictureWatermark1"/>
-                      <pic:cNvPicPr/>
-                    </pic:nvPicPr>
-                    <pic:blipFill>
-                      <a:blip r:embed="rId1">
-                        <a:lum bright="70000" contrast="-70000"/>
-                      </a:blip>
-                      <a:stretch/>
-                    </pic:blipFill>
-                    <pic:spPr>
-                      <a:xfrm>
-                        <a:off x="0" y="0"/>
-                        <a:ext cx="5731560" cy="3820680"/>
-                      </a:xfrm>
-                      <a:prstGeom prst="rect">
-                        <a:avLst/>
-                      </a:prstGeom>
-                      <a:noFill/>
-                      <a:ln w="0">
-                        <a:noFill/>
-                      </a:ln>
-                    </pic:spPr>
-                  </pic:pic>
-                </a:graphicData>
-              </a:graphic>
-            </wp:anchor>
-          </w:drawing>
-        </mc:Choice>
-        <mc:Fallback>
-          <w:pict>
-            <v:shape id="WordPictureWatermark1" o:spid="shape_0" stroked="f" o:allowincell="f" style="position:absolute;margin-left:0pt;margin-top:177.85pt;width:451.25pt;height:300.8pt;mso-wrap-style:none;v-text-anchor:middle;mso-position-horizontal:center;mso-position-horizontal-relative:margin;mso-position-vertical:center;mso-position-vertical-relative:margin" type="_x0000_t75">
-              <v:imagedata r:id="rId2" o:detectmouseclick="t"/>
-              <v:stroke color="#3465a4" joinstyle="round" endcap="flat"/>
-              <w10:wrap type="none"/>
-            </v:shape>
-          </w:pict>
-        </mc:Fallback>
-      </mc:AlternateContent>
+      <w:drawing>
+        <wp:anchor distT="0" distB="0" distL="0" distR="0" simplePos="0" relativeHeight="11" behindDoc="1" locked="0" layoutInCell="0" allowOverlap="1">
+          <wp:simplePos x="0" y="0"/>
+          <wp:positionH relativeFrom="margin">
+            <wp:align>center</wp:align>
+          </wp:positionH>
+          <wp:positionV relativeFrom="margin">
+            <wp:align>center</wp:align>
+          </wp:positionV>
+          <wp:extent cx="5731510" cy="3820795"/>
+          <wp:effectExtent l="0" t="0" r="0" b="0"/>
+          <wp:wrapNone/>
+          <wp:docPr id="3" name="WordPictureWatermark1"/>
+          <wp:cNvGraphicFramePr>
+            <a:graphicFrameLocks xmlns:a="http://schemas.openxmlformats.org/drawingml/2006/main" noChangeAspect="1"/>
+          </wp:cNvGraphicFramePr>
+          <a:graphic xmlns:a="http://schemas.openxmlformats.org/drawingml/2006/main">
+            <a:graphicData uri="http://schemas.openxmlformats.org/drawingml/2006/picture">
+              <pic:pic xmlns:pic="http://schemas.openxmlformats.org/drawingml/2006/picture">
+                <pic:nvPicPr>
+                  <pic:cNvPr id="3" name="WordPictureWatermark1"/>
+                  <pic:cNvPicPr>
+                    <a:picLocks noChangeAspect="1" noChangeArrowheads="1"/>
+                  </pic:cNvPicPr>
+                </pic:nvPicPr>
+                <pic:blipFill>
+                  <a:blip r:embed="rId1">
+                    <a:lum bright="70000" contrast="-70000"/>
+                  </a:blip>
+                  <a:stretch>
+                    <a:fillRect/>
+                  </a:stretch>
+                </pic:blipFill>
+                <pic:spPr bwMode="auto">
+                  <a:xfrm>
+                    <a:off x="0" y="0"/>
+                    <a:ext cx="5731510" cy="3820795"/>
+                  </a:xfrm>
+                  <a:prstGeom prst="rect">
+                    <a:avLst/>
+                  </a:prstGeom>
+                  <a:noFill/>
+                </pic:spPr>
+              </pic:pic>
+            </a:graphicData>
+          </a:graphic>
+        </wp:anchor>
+      </w:drawing>
     </w:r>
   </w:p>
 </w:hdr>
@@ -4221,6 +4242,7 @@
     <w:qFormat/>
     <w:pPr>
       <w:widowControl/>
+      <w:suppressAutoHyphens w:val="true"/>
       <w:bidi w:val="0"/>
       <w:spacing w:lineRule="auto" w:line="276" w:before="0" w:after="0"/>
       <w:jc w:val="start"/>

</xml_diff>

<commit_message>
removed unneccessary resets + changed to sync active-hi rst
</commit_message>
<xml_diff>
--- a/docs/Zynq Networking Dataplane Specifications.docx
+++ b/docs/Zynq Networking Dataplane Specifications.docx
@@ -2286,41 +2286,51 @@
           <w:bCs w:val="false"/>
           <w:lang w:val="en-US"/>
         </w:rPr>
-        <w:t xml:space="preserve">- </w:t>
-      </w:r>
-      <w:r>
+        <w:t>- BRAM tables shouldn’t use reset signal also CSR doesn’t need reset since all of these are controleld by PS (we can initate all of the registers before enabling dataplane)</w:t>
+      </w:r>
+    </w:p>
+    <w:p>
+      <w:pPr>
+        <w:pStyle w:val="Normal"/>
         <w:rPr>
           <w:b w:val="false"/>
           <w:bCs w:val="false"/>
           <w:lang w:val="en-US"/>
         </w:rPr>
-        <w:t>BRAM tables shouldn’t use reset signal also CSR doesn’t need reset since all of these are controleld by PS (we can initate all of the registers before enabling dataplane)</w:t>
-      </w:r>
-    </w:p>
-    <w:p>
-      <w:pPr>
-        <w:pStyle w:val="Normal"/>
+      </w:pPr>
+      <w:r>
         <w:rPr>
           <w:b w:val="false"/>
           <w:bCs w:val="false"/>
           <w:lang w:val="en-US"/>
         </w:rPr>
-      </w:pPr>
-      <w:r>
+        <w:t>- We should adda dp_start set/clear CSR that enables the dataplane (can be used for example after all of the tables / CSR’s have been initialized)</w:t>
+      </w:r>
+    </w:p>
+    <w:p>
+      <w:pPr>
+        <w:pStyle w:val="Normal"/>
         <w:rPr>
           <w:b w:val="false"/>
           <w:bCs w:val="false"/>
           <w:lang w:val="en-US"/>
         </w:rPr>
-        <w:t xml:space="preserve">- </w:t>
-      </w:r>
+      </w:pPr>
       <w:r>
         <w:rPr>
           <w:b w:val="false"/>
           <w:bCs w:val="false"/>
           <w:lang w:val="en-US"/>
         </w:rPr>
-        <w:t>We should adda dp_start set/clear CSR that enables the dataplane (can be used for example after all of the tables / CSR’s have been initialized)</w:t>
+        <w:t xml:space="preserve">- </w:t>
+      </w:r>
+      <w:r>
+        <w:rPr>
+          <w:b w:val="false"/>
+          <w:bCs w:val="false"/>
+          <w:lang w:val="en-US"/>
+        </w:rPr>
+        <w:t xml:space="preserve">Xilinx recommends using synchronous active-high resets with FPGA’s. Active-low requires an inverter chich can be absorbed into the register or add an extra logic level to the path </w:t>
       </w:r>
     </w:p>
     <w:p>

</xml_diff>

<commit_message>
added modify logic & architecture for modify phase (UNFINISHED)
</commit_message>
<xml_diff>
--- a/docs/Zynq Networking Dataplane Specifications.docx
+++ b/docs/Zynq Networking Dataplane Specifications.docx
@@ -2322,15 +2322,33 @@
           <w:bCs w:val="false"/>
           <w:lang w:val="en-US"/>
         </w:rPr>
-        <w:t xml:space="preserve">- </w:t>
-      </w:r>
-      <w:r>
+        <w:t xml:space="preserve">- Xilinx recommends using synchronous active-high resets with FPGA’s. Active-low requires an inverter chich can be absorbed into the register or add an extra logic level to the path </w:t>
+      </w:r>
+    </w:p>
+    <w:p>
+      <w:pPr>
+        <w:pStyle w:val="Normal"/>
         <w:rPr>
           <w:b w:val="false"/>
           <w:bCs w:val="false"/>
           <w:lang w:val="en-US"/>
         </w:rPr>
-        <w:t xml:space="preserve">Xilinx recommends using synchronous active-high resets with FPGA’s. Active-low requires an inverter chich can be absorbed into the register or add an extra logic level to the path </w:t>
+      </w:pPr>
+      <w:r>
+        <w:rPr>
+          <w:b w:val="false"/>
+          <w:bCs w:val="false"/>
+          <w:lang w:val="en-US"/>
+        </w:rPr>
+        <w:t xml:space="preserve">- </w:t>
+      </w:r>
+      <w:r>
+        <w:rPr>
+          <w:b w:val="false"/>
+          <w:bCs w:val="false"/>
+          <w:lang w:val="en-US"/>
+        </w:rPr>
+        <w:t>make sure action stage modify endian is correct and also that after modifying the upcoming data is not old headers and if there are tkeep other than ‘1 then we need to add logic that sets data accordingly, currently we expect that the header comes with tkeep ‘1 format but it can have holes and then the old headers and data get corrupt. Outgoing tkeep shouldn’t be altered like it is currently.</w:t>
       </w:r>
     </w:p>
     <w:p>

</xml_diff>

<commit_message>
more stuff to verify with formal, spec/block design updates, csr reset update
</commit_message>
<xml_diff>
--- a/docs/Zynq Networking Dataplane Specifications.docx
+++ b/docs/Zynq Networking Dataplane Specifications.docx
@@ -1,6 +1,6 @@
 
 <file path=word/document.xml><?xml version="1.0" encoding="utf-8"?>
-<w:document xmlns:o="urn:schemas-microsoft-com:office:office" xmlns:r="http://schemas.openxmlformats.org/officeDocument/2006/relationships" xmlns:v="urn:schemas-microsoft-com:vml" xmlns:w="http://schemas.openxmlformats.org/wordprocessingml/2006/main" xmlns:w10="urn:schemas-microsoft-com:office:word" xmlns:wp="http://schemas.openxmlformats.org/drawingml/2006/wordprocessingDrawing" xmlns:pic="http://schemas.openxmlformats.org/drawingml/2006/picture" xmlns:wps="http://schemas.microsoft.com/office/word/2010/wordprocessingShape" xmlns:wpg="http://schemas.microsoft.com/office/word/2010/wordprocessingGroup" xmlns:mc="http://schemas.openxmlformats.org/markup-compatibility/2006" xmlns:wp14="http://schemas.microsoft.com/office/word/2010/wordprocessingDrawing" xmlns:w14="http://schemas.microsoft.com/office/word/2010/wordml" xmlns:w15="http://schemas.microsoft.com/office/word/2012/wordml" mc:Ignorable="w14 wp14 w15">
+<w:document xmlns:o="urn:schemas-microsoft-com:office:office" xmlns:r="http://schemas.openxmlformats.org/officeDocument/2006/relationships" xmlns:v="urn:schemas-microsoft-com:vml" xmlns:w="http://schemas.openxmlformats.org/wordprocessingml/2006/main" xmlns:w10="urn:schemas-microsoft-com:office:word" xmlns:wp="http://schemas.openxmlformats.org/drawingml/2006/wordprocessingDrawing" xmlns:wps="http://schemas.microsoft.com/office/word/2010/wordprocessingShape" xmlns:wpg="http://schemas.microsoft.com/office/word/2010/wordprocessingGroup" xmlns:mc="http://schemas.openxmlformats.org/markup-compatibility/2006" xmlns:wp14="http://schemas.microsoft.com/office/word/2010/wordprocessingDrawing" xmlns:w14="http://schemas.microsoft.com/office/word/2010/wordml" xmlns:w15="http://schemas.microsoft.com/office/word/2012/wordml" mc:Ignorable="w14 wp14 w15">
   <w:body>
     <w:p>
       <w:pPr>
@@ -155,14 +155,14 @@
       <w:tblPr>
         <w:tblStyle w:val="a"/>
         <w:tblW w:w="9029" w:type="dxa"/>
-        <w:jc w:val="start"/>
+        <w:jc w:val="left"/>
         <w:tblInd w:w="0" w:type="dxa"/>
         <w:tblLayout w:type="fixed"/>
         <w:tblCellMar>
           <w:top w:w="100" w:type="dxa"/>
-          <w:start w:w="100" w:type="dxa"/>
+          <w:left w:w="100" w:type="dxa"/>
           <w:bottom w:w="100" w:type="dxa"/>
-          <w:end w:w="100" w:type="dxa"/>
+          <w:right w:w="100" w:type="dxa"/>
         </w:tblCellMar>
         <w:tblLook w:val="0600" w:noHBand="1" w:noVBand="1" w:firstColumn="0" w:lastRow="0" w:lastColumn="0" w:firstRow="0"/>
       </w:tblPr>
@@ -170,7 +170,7 @@
         <w:gridCol w:w="2258"/>
         <w:gridCol w:w="2257"/>
         <w:gridCol w:w="2256"/>
-        <w:gridCol w:w="2258"/>
+        <w:gridCol w:w="2257"/>
       </w:tblGrid>
       <w:tr>
         <w:trPr/>
@@ -179,9 +179,9 @@
             <w:tcW w:w="2258" w:type="dxa"/>
             <w:tcBorders>
               <w:top w:val="single" w:sz="8" w:space="0" w:color="000000"/>
-              <w:start w:val="single" w:sz="8" w:space="0" w:color="000000"/>
+              <w:left w:val="single" w:sz="8" w:space="0" w:color="000000"/>
               <w:bottom w:val="single" w:sz="8" w:space="0" w:color="000000"/>
-              <w:end w:val="single" w:sz="8" w:space="0" w:color="000000"/>
+              <w:right w:val="single" w:sz="8" w:space="0" w:color="000000"/>
             </w:tcBorders>
             <w:shd w:color="auto" w:fill="6D9EEB" w:val="clear"/>
           </w:tcPr>
@@ -217,9 +217,9 @@
             <w:tcW w:w="2257" w:type="dxa"/>
             <w:tcBorders>
               <w:top w:val="single" w:sz="8" w:space="0" w:color="000000"/>
-              <w:start w:val="single" w:sz="8" w:space="0" w:color="000000"/>
+              <w:left w:val="single" w:sz="8" w:space="0" w:color="000000"/>
               <w:bottom w:val="single" w:sz="8" w:space="0" w:color="000000"/>
-              <w:end w:val="single" w:sz="8" w:space="0" w:color="000000"/>
+              <w:right w:val="single" w:sz="8" w:space="0" w:color="000000"/>
             </w:tcBorders>
             <w:shd w:color="auto" w:fill="6D9EEB" w:val="clear"/>
           </w:tcPr>
@@ -255,9 +255,9 @@
             <w:tcW w:w="2256" w:type="dxa"/>
             <w:tcBorders>
               <w:top w:val="single" w:sz="8" w:space="0" w:color="000000"/>
-              <w:start w:val="single" w:sz="8" w:space="0" w:color="000000"/>
+              <w:left w:val="single" w:sz="8" w:space="0" w:color="000000"/>
               <w:bottom w:val="single" w:sz="8" w:space="0" w:color="000000"/>
-              <w:end w:val="single" w:sz="8" w:space="0" w:color="000000"/>
+              <w:right w:val="single" w:sz="8" w:space="0" w:color="000000"/>
             </w:tcBorders>
             <w:shd w:color="auto" w:fill="6D9EEB" w:val="clear"/>
           </w:tcPr>
@@ -290,12 +290,12 @@
         </w:tc>
         <w:tc>
           <w:tcPr>
-            <w:tcW w:w="2258" w:type="dxa"/>
+            <w:tcW w:w="2257" w:type="dxa"/>
             <w:tcBorders>
               <w:top w:val="single" w:sz="8" w:space="0" w:color="000000"/>
-              <w:start w:val="single" w:sz="8" w:space="0" w:color="000000"/>
+              <w:left w:val="single" w:sz="8" w:space="0" w:color="000000"/>
               <w:bottom w:val="single" w:sz="8" w:space="0" w:color="000000"/>
-              <w:end w:val="single" w:sz="8" w:space="0" w:color="000000"/>
+              <w:right w:val="single" w:sz="8" w:space="0" w:color="000000"/>
             </w:tcBorders>
             <w:shd w:color="auto" w:fill="6D9EEB" w:val="clear"/>
           </w:tcPr>
@@ -334,9 +334,9 @@
             <w:tcW w:w="2258" w:type="dxa"/>
             <w:tcBorders>
               <w:top w:val="single" w:sz="8" w:space="0" w:color="000000"/>
-              <w:start w:val="single" w:sz="8" w:space="0" w:color="000000"/>
+              <w:left w:val="single" w:sz="8" w:space="0" w:color="000000"/>
               <w:bottom w:val="single" w:sz="8" w:space="0" w:color="000000"/>
-              <w:end w:val="single" w:sz="8" w:space="0" w:color="000000"/>
+              <w:right w:val="single" w:sz="8" w:space="0" w:color="000000"/>
             </w:tcBorders>
             <w:shd w:color="auto" w:fill="C9DAF8" w:val="clear"/>
           </w:tcPr>
@@ -366,9 +366,9 @@
             <w:tcW w:w="2257" w:type="dxa"/>
             <w:tcBorders>
               <w:top w:val="single" w:sz="8" w:space="0" w:color="000000"/>
-              <w:start w:val="single" w:sz="8" w:space="0" w:color="000000"/>
+              <w:left w:val="single" w:sz="8" w:space="0" w:color="000000"/>
               <w:bottom w:val="single" w:sz="8" w:space="0" w:color="000000"/>
-              <w:end w:val="single" w:sz="8" w:space="0" w:color="000000"/>
+              <w:right w:val="single" w:sz="8" w:space="0" w:color="000000"/>
             </w:tcBorders>
             <w:shd w:color="auto" w:fill="C9DAF8" w:val="clear"/>
           </w:tcPr>
@@ -398,9 +398,9 @@
             <w:tcW w:w="2256" w:type="dxa"/>
             <w:tcBorders>
               <w:top w:val="single" w:sz="8" w:space="0" w:color="000000"/>
-              <w:start w:val="single" w:sz="8" w:space="0" w:color="000000"/>
+              <w:left w:val="single" w:sz="8" w:space="0" w:color="000000"/>
               <w:bottom w:val="single" w:sz="8" w:space="0" w:color="000000"/>
-              <w:end w:val="single" w:sz="8" w:space="0" w:color="000000"/>
+              <w:right w:val="single" w:sz="8" w:space="0" w:color="000000"/>
             </w:tcBorders>
             <w:shd w:color="auto" w:fill="C9DAF8" w:val="clear"/>
           </w:tcPr>
@@ -427,12 +427,12 @@
         </w:tc>
         <w:tc>
           <w:tcPr>
-            <w:tcW w:w="2258" w:type="dxa"/>
+            <w:tcW w:w="2257" w:type="dxa"/>
             <w:tcBorders>
               <w:top w:val="single" w:sz="8" w:space="0" w:color="000000"/>
-              <w:start w:val="single" w:sz="8" w:space="0" w:color="000000"/>
+              <w:left w:val="single" w:sz="8" w:space="0" w:color="000000"/>
               <w:bottom w:val="single" w:sz="8" w:space="0" w:color="000000"/>
-              <w:end w:val="single" w:sz="8" w:space="0" w:color="000000"/>
+              <w:right w:val="single" w:sz="8" w:space="0" w:color="000000"/>
             </w:tcBorders>
             <w:shd w:color="auto" w:fill="C9DAF8" w:val="clear"/>
           </w:tcPr>
@@ -465,9 +465,9 @@
             <w:tcW w:w="2258" w:type="dxa"/>
             <w:tcBorders>
               <w:top w:val="single" w:sz="8" w:space="0" w:color="000000"/>
-              <w:start w:val="single" w:sz="8" w:space="0" w:color="000000"/>
+              <w:left w:val="single" w:sz="8" w:space="0" w:color="000000"/>
               <w:bottom w:val="single" w:sz="8" w:space="0" w:color="000000"/>
-              <w:end w:val="single" w:sz="8" w:space="0" w:color="000000"/>
+              <w:right w:val="single" w:sz="8" w:space="0" w:color="000000"/>
             </w:tcBorders>
             <w:shd w:color="auto" w:fill="C9DAF8" w:val="clear"/>
           </w:tcPr>
@@ -497,9 +497,9 @@
             <w:tcW w:w="2257" w:type="dxa"/>
             <w:tcBorders>
               <w:top w:val="single" w:sz="8" w:space="0" w:color="000000"/>
-              <w:start w:val="single" w:sz="8" w:space="0" w:color="000000"/>
+              <w:left w:val="single" w:sz="8" w:space="0" w:color="000000"/>
               <w:bottom w:val="single" w:sz="8" w:space="0" w:color="000000"/>
-              <w:end w:val="single" w:sz="8" w:space="0" w:color="000000"/>
+              <w:right w:val="single" w:sz="8" w:space="0" w:color="000000"/>
             </w:tcBorders>
             <w:shd w:color="auto" w:fill="C9DAF8" w:val="clear"/>
           </w:tcPr>
@@ -529,9 +529,9 @@
             <w:tcW w:w="2256" w:type="dxa"/>
             <w:tcBorders>
               <w:top w:val="single" w:sz="8" w:space="0" w:color="000000"/>
-              <w:start w:val="single" w:sz="8" w:space="0" w:color="000000"/>
+              <w:left w:val="single" w:sz="8" w:space="0" w:color="000000"/>
               <w:bottom w:val="single" w:sz="8" w:space="0" w:color="000000"/>
-              <w:end w:val="single" w:sz="8" w:space="0" w:color="000000"/>
+              <w:right w:val="single" w:sz="8" w:space="0" w:color="000000"/>
             </w:tcBorders>
             <w:shd w:color="auto" w:fill="C9DAF8" w:val="clear"/>
           </w:tcPr>
@@ -558,12 +558,12 @@
         </w:tc>
         <w:tc>
           <w:tcPr>
-            <w:tcW w:w="2258" w:type="dxa"/>
+            <w:tcW w:w="2257" w:type="dxa"/>
             <w:tcBorders>
               <w:top w:val="single" w:sz="8" w:space="0" w:color="000000"/>
-              <w:start w:val="single" w:sz="8" w:space="0" w:color="000000"/>
+              <w:left w:val="single" w:sz="8" w:space="0" w:color="000000"/>
               <w:bottom w:val="single" w:sz="8" w:space="0" w:color="000000"/>
-              <w:end w:val="single" w:sz="8" w:space="0" w:color="000000"/>
+              <w:right w:val="single" w:sz="8" w:space="0" w:color="000000"/>
             </w:tcBorders>
             <w:shd w:color="auto" w:fill="C9DAF8" w:val="clear"/>
           </w:tcPr>
@@ -733,18 +733,18 @@
           </w:r>
           <w:r>
             <w:rPr>
+              <w:webHidden/>
               <w:rStyle w:val="IndexLink"/>
               <w:vanish w:val="false"/>
-              <w:webHidden/>
               <w:lang w:val="en-US"/>
             </w:rPr>
             <w:instrText xml:space="preserve"> TOC \z \o "1-3" \u \h</w:instrText>
           </w:r>
           <w:r>
             <w:rPr>
+              <w:webHidden/>
               <w:rStyle w:val="IndexLink"/>
               <w:vanish w:val="false"/>
-              <w:webHidden/>
               <w:lang w:val="en-US"/>
             </w:rPr>
             <w:fldChar w:fldCharType="separate"/>
@@ -752,9 +752,9 @@
           <w:hyperlink w:anchor="_Toc221458742">
             <w:r>
               <w:rPr>
+                <w:webHidden/>
                 <w:rStyle w:val="IndexLink"/>
                 <w:vanish w:val="false"/>
-                <w:webHidden/>
                 <w:lang w:val="en-US"/>
               </w:rPr>
               <w:t>2</w:t>
@@ -832,9 +832,9 @@
           <w:hyperlink w:anchor="_Toc221458743">
             <w:r>
               <w:rPr>
+                <w:webHidden/>
                 <w:rStyle w:val="IndexLink"/>
                 <w:vanish w:val="false"/>
-                <w:webHidden/>
               </w:rPr>
               <w:t>3</w:t>
             </w:r>
@@ -910,9 +910,9 @@
           <w:hyperlink w:anchor="_Toc221458744">
             <w:r>
               <w:rPr>
+                <w:webHidden/>
                 <w:rStyle w:val="IndexLink"/>
                 <w:vanish w:val="false"/>
-                <w:webHidden/>
               </w:rPr>
               <w:t>3.1</w:t>
             </w:r>
@@ -988,10 +988,10 @@
           <w:hyperlink w:anchor="_Toc221458745">
             <w:r>
               <w:rPr>
+                <w:webHidden/>
                 <w:rStyle w:val="IndexLink"/>
                 <w:rFonts w:cs="Times New Roman" w:ascii="Times New Roman" w:hAnsi="Times New Roman"/>
                 <w:vanish w:val="false"/>
-                <w:webHidden/>
               </w:rPr>
               <w:t>3.1.1</w:t>
             </w:r>
@@ -1068,10 +1068,10 @@
           <w:hyperlink w:anchor="_Toc221458746">
             <w:r>
               <w:rPr>
+                <w:webHidden/>
                 <w:rStyle w:val="IndexLink"/>
                 <w:rFonts w:cs="Times New Roman" w:ascii="Times New Roman" w:hAnsi="Times New Roman"/>
                 <w:vanish w:val="false"/>
-                <w:webHidden/>
                 <w:lang w:val="en-US"/>
               </w:rPr>
               <w:t>3.1.2</w:t>
@@ -1150,10 +1150,10 @@
           <w:hyperlink w:anchor="_Toc221458747">
             <w:r>
               <w:rPr>
+                <w:webHidden/>
                 <w:rStyle w:val="IndexLink"/>
                 <w:rFonts w:cs="Times New Roman" w:ascii="Times New Roman" w:hAnsi="Times New Roman"/>
                 <w:vanish w:val="false"/>
-                <w:webHidden/>
                 <w:lang w:val="en-US"/>
               </w:rPr>
               <w:t>3.1.3</w:t>
@@ -1232,10 +1232,10 @@
           <w:hyperlink w:anchor="_Toc221458748">
             <w:r>
               <w:rPr>
+                <w:webHidden/>
                 <w:rStyle w:val="IndexLink"/>
                 <w:rFonts w:cs="Times New Roman" w:ascii="Times New Roman" w:hAnsi="Times New Roman"/>
                 <w:vanish w:val="false"/>
-                <w:webHidden/>
               </w:rPr>
               <w:t>3.1.4</w:t>
             </w:r>
@@ -1312,10 +1312,10 @@
           <w:hyperlink w:anchor="_Toc221458749">
             <w:r>
               <w:rPr>
+                <w:webHidden/>
                 <w:rStyle w:val="IndexLink"/>
                 <w:rFonts w:cs="Times New Roman" w:ascii="Times New Roman" w:hAnsi="Times New Roman"/>
                 <w:vanish w:val="false"/>
-                <w:webHidden/>
                 <w:lang w:val="en-US"/>
               </w:rPr>
               <w:t>3.1.5</w:t>
@@ -1394,10 +1394,10 @@
           <w:hyperlink w:anchor="_Toc221458750">
             <w:r>
               <w:rPr>
+                <w:webHidden/>
                 <w:rStyle w:val="IndexLink"/>
                 <w:rFonts w:cs="Times New Roman" w:ascii="Times New Roman" w:hAnsi="Times New Roman"/>
                 <w:vanish w:val="false"/>
-                <w:webHidden/>
                 <w:lang w:val="en-US"/>
               </w:rPr>
               <w:t>3.1.6</w:t>
@@ -1476,10 +1476,10 @@
           <w:hyperlink w:anchor="_Toc221458751">
             <w:r>
               <w:rPr>
+                <w:webHidden/>
                 <w:rStyle w:val="IndexLink"/>
                 <w:rFonts w:cs="Times New Roman" w:ascii="Times New Roman" w:hAnsi="Times New Roman"/>
                 <w:vanish w:val="false"/>
-                <w:webHidden/>
                 <w:lang w:val="en-US"/>
               </w:rPr>
               <w:t>3.1.7</w:t>
@@ -1558,10 +1558,10 @@
           <w:hyperlink w:anchor="_Toc221458752">
             <w:r>
               <w:rPr>
+                <w:webHidden/>
                 <w:rStyle w:val="IndexLink"/>
                 <w:rFonts w:cs="Times New Roman" w:ascii="Times New Roman" w:hAnsi="Times New Roman"/>
                 <w:vanish w:val="false"/>
-                <w:webHidden/>
                 <w:lang w:val="en-US"/>
               </w:rPr>
               <w:t>3.1.8</w:t>
@@ -1640,10 +1640,10 @@
           <w:hyperlink w:anchor="_Toc221458753">
             <w:r>
               <w:rPr>
+                <w:webHidden/>
                 <w:rStyle w:val="IndexLink"/>
                 <w:rFonts w:cs="Times New Roman" w:ascii="Times New Roman" w:hAnsi="Times New Roman"/>
                 <w:vanish w:val="false"/>
-                <w:webHidden/>
                 <w:lang w:val="en-US"/>
               </w:rPr>
               <w:t>3.1.9</w:t>
@@ -1722,10 +1722,10 @@
           <w:hyperlink w:anchor="_Toc221458754">
             <w:r>
               <w:rPr>
+                <w:webHidden/>
                 <w:rStyle w:val="IndexLink"/>
                 <w:rFonts w:cs="Times New Roman" w:ascii="Times New Roman" w:hAnsi="Times New Roman"/>
                 <w:vanish w:val="false"/>
-                <w:webHidden/>
                 <w:lang w:val="en-US"/>
               </w:rPr>
               <w:t>3.1.10</w:t>
@@ -1804,10 +1804,10 @@
           <w:hyperlink w:anchor="_Toc221458755">
             <w:r>
               <w:rPr>
+                <w:webHidden/>
                 <w:rStyle w:val="IndexLink"/>
                 <w:rFonts w:cs="Times New Roman" w:ascii="Times New Roman" w:hAnsi="Times New Roman"/>
                 <w:vanish w:val="false"/>
-                <w:webHidden/>
                 <w:lang w:val="en-US"/>
               </w:rPr>
               <w:t>3.1.11</w:t>
@@ -2137,7 +2137,6 @@
                     <a:prstGeom prst="rect">
                       <a:avLst/>
                     </a:prstGeom>
-                    <a:noFill/>
                   </pic:spPr>
                 </pic:pic>
               </a:graphicData>
@@ -2152,6 +2151,7 @@
         <w:rPr>
           <w:rFonts w:ascii="Times New Roman" w:hAnsi="Times New Roman" w:cs="Times New Roman"/>
           <w:i/>
+          <w:i/>
           <w:iCs/>
         </w:rPr>
       </w:pPr>
@@ -2232,7 +2232,7 @@
           <w:bCs w:val="false"/>
           <w:lang w:val="en-US"/>
         </w:rPr>
-        <w:t>- Flow key should most likely be held stable for the whole packet duration to allow flow_id and flow_hit to remain stable so data is directed correctly in the action stage</w:t>
+        <w:t>- Flow key should be held stable for the whole packet duration to allow flow_id and flow_hit to remain stable so data is directed correctly in the action stage</w:t>
       </w:r>
     </w:p>
     <w:p>
@@ -2250,105 +2250,105 @@
           <w:bCs w:val="false"/>
           <w:lang w:val="en-US"/>
         </w:rPr>
-        <w:t>- Action stages modify phase should be aware what section of header is on going to correctly modify destination mac address and source mac address fields. This could be done with either header signal and simple counter or SOP signal and header bit counter</w:t>
-      </w:r>
-    </w:p>
-    <w:p>
-      <w:pPr>
-        <w:pStyle w:val="Normal"/>
+        <w:t xml:space="preserve">- </w:t>
+      </w:r>
+      <w:r>
         <w:rPr>
           <w:b w:val="false"/>
           <w:bCs w:val="false"/>
           <w:lang w:val="en-US"/>
         </w:rPr>
-      </w:pPr>
-      <w:r>
+        <w:t>Include dataplane control fiels: enable, loopback, flow_table_flush (self-clearing), default_action, irq_enable, stats_clear (self-clearing)</w:t>
+      </w:r>
+    </w:p>
+    <w:p>
+      <w:pPr>
+        <w:pStyle w:val="Normal"/>
         <w:rPr>
           <w:b w:val="false"/>
           <w:bCs w:val="false"/>
           <w:lang w:val="en-US"/>
         </w:rPr>
-        <w:t>- Should action stage or other axi stream pipelining registers contain a reset signal (Causes higher fanouts which could cause problems with timing requirements). We can use GSR (global set/reset line) on FPGA to reduce the need for high fanout reset signal.</w:t>
-      </w:r>
-    </w:p>
-    <w:p>
-      <w:pPr>
-        <w:pStyle w:val="Normal"/>
+      </w:pPr>
+      <w:r>
         <w:rPr>
           <w:b w:val="false"/>
           <w:bCs w:val="false"/>
           <w:lang w:val="en-US"/>
         </w:rPr>
-      </w:pPr>
-      <w:r>
+        <w:t>- Action stages modify phase should be aware what section of header is on going to correctly modify destination mac address and source mac address fields. This could be done with either header signal and simple counter or SOP signal and header bit counter</w:t>
+      </w:r>
+    </w:p>
+    <w:p>
+      <w:pPr>
+        <w:pStyle w:val="Normal"/>
         <w:rPr>
           <w:b w:val="false"/>
           <w:bCs w:val="false"/>
           <w:lang w:val="en-US"/>
         </w:rPr>
-        <w:t>- BRAM tables shouldn’t use reset signal also CSR doesn’t need reset since all of these are controleld by PS (we can initate all of the registers before enabling dataplane)</w:t>
-      </w:r>
-    </w:p>
-    <w:p>
-      <w:pPr>
-        <w:pStyle w:val="Normal"/>
+      </w:pPr>
+      <w:r>
         <w:rPr>
           <w:b w:val="false"/>
           <w:bCs w:val="false"/>
           <w:lang w:val="en-US"/>
         </w:rPr>
-      </w:pPr>
-      <w:r>
+        <w:t>- BRAM tables shouldn’t use reset signal also CSR doesn’t need reset since all of these are controleld by PS (we can initate all of the registers before enabling dataplane)</w:t>
+      </w:r>
+    </w:p>
+    <w:p>
+      <w:pPr>
+        <w:pStyle w:val="Normal"/>
         <w:rPr>
           <w:b w:val="false"/>
           <w:bCs w:val="false"/>
           <w:lang w:val="en-US"/>
         </w:rPr>
-        <w:t>- We should adda dp_start set/clear CSR that enables the dataplane (can be used for example after all of the tables / CSR’s have been initialized)</w:t>
-      </w:r>
-    </w:p>
-    <w:p>
-      <w:pPr>
-        <w:pStyle w:val="Normal"/>
+      </w:pPr>
+      <w:r>
         <w:rPr>
           <w:b w:val="false"/>
           <w:bCs w:val="false"/>
           <w:lang w:val="en-US"/>
         </w:rPr>
-      </w:pPr>
-      <w:r>
+        <w:t>- We should adda dp_start set/clear CSR that enables the dataplane (can be used for example after all of the tables / CSR’s have been initialized)</w:t>
+      </w:r>
+    </w:p>
+    <w:p>
+      <w:pPr>
+        <w:pStyle w:val="Normal"/>
         <w:rPr>
           <w:b w:val="false"/>
           <w:bCs w:val="false"/>
           <w:lang w:val="en-US"/>
         </w:rPr>
-        <w:t xml:space="preserve">- Xilinx recommends using synchronous active-high resets with FPGA’s. Active-low requires an inverter chich can be absorbed into the register or add an extra logic level to the path </w:t>
-      </w:r>
-    </w:p>
-    <w:p>
-      <w:pPr>
-        <w:pStyle w:val="Normal"/>
+      </w:pPr>
+      <w:r>
         <w:rPr>
           <w:b w:val="false"/>
           <w:bCs w:val="false"/>
           <w:lang w:val="en-US"/>
         </w:rPr>
-      </w:pPr>
-      <w:r>
+        <w:t xml:space="preserve">- Xilinx recommends using synchronous active-high resets with FPGA’s. Active-low requires an inverter chich can be absorbed into the register or add an extra logic level to the path </w:t>
+      </w:r>
+    </w:p>
+    <w:p>
+      <w:pPr>
+        <w:pStyle w:val="Normal"/>
         <w:rPr>
           <w:b w:val="false"/>
           <w:bCs w:val="false"/>
           <w:lang w:val="en-US"/>
         </w:rPr>
-        <w:t xml:space="preserve">- </w:t>
-      </w:r>
+      </w:pPr>
       <w:r>
         <w:rPr>
           <w:b w:val="false"/>
           <w:bCs w:val="false"/>
           <w:lang w:val="en-US"/>
         </w:rPr>
-        <w:t>make sure action stage modify endian is correct and also that after modifying the upcoming data is not old headers and if there are tkeep other than ‘1 then we need to add logic that sets data accordingly, currently we expect that the header comes with tkeep ‘1 format but it can have holes and then the old headers and data get corrupt. Outgoing tkeep shouldn’t be altered like it is currently.</w:t>
+        <w:t>- make sure action stage modify endian is correct and also that after modifying the upcoming data is not old headers and if there are tkeep other than ‘1 then we need to add logic that sets data accordingly, currently we expect that the header comes with tkeep ‘1 format but it can have holes and then the old headers and data get corrupt. Outgoing tkeep shouldn’t be altered like it is currently.</w:t>
       </w:r>
     </w:p>
     <w:p>
@@ -2611,20 +2611,20 @@
       <w:tblPr>
         <w:tblStyle w:val="TaulukkoRuudukko"/>
         <w:tblW w:w="9019" w:type="dxa"/>
-        <w:jc w:val="start"/>
+        <w:jc w:val="left"/>
         <w:tblInd w:w="0" w:type="dxa"/>
         <w:tblLayout w:type="fixed"/>
         <w:tblCellMar>
           <w:top w:w="0" w:type="dxa"/>
-          <w:start w:w="108" w:type="dxa"/>
+          <w:left w:w="108" w:type="dxa"/>
           <w:bottom w:w="0" w:type="dxa"/>
-          <w:end w:w="108" w:type="dxa"/>
+          <w:right w:w="108" w:type="dxa"/>
         </w:tblCellMar>
         <w:tblLook w:val="04a0" w:noHBand="0" w:noVBand="1" w:firstColumn="1" w:lastRow="0" w:lastColumn="0" w:firstRow="1"/>
       </w:tblPr>
       <w:tblGrid>
         <w:gridCol w:w="4509"/>
-        <w:gridCol w:w="4510"/>
+        <w:gridCol w:w="4509"/>
       </w:tblGrid>
       <w:tr>
         <w:trPr/>
@@ -2666,7 +2666,7 @@
         </w:tc>
         <w:tc>
           <w:tcPr>
-            <w:tcW w:w="4510" w:type="dxa"/>
+            <w:tcW w:w="4509" w:type="dxa"/>
             <w:tcBorders/>
             <w:shd w:color="auto" w:fill="C6D9F1" w:themeFill="text2" w:themeFillTint="33" w:val="clear"/>
           </w:tcPr>
@@ -2736,7 +2736,7 @@
         </w:tc>
         <w:tc>
           <w:tcPr>
-            <w:tcW w:w="4510" w:type="dxa"/>
+            <w:tcW w:w="4509" w:type="dxa"/>
             <w:tcBorders/>
           </w:tcPr>
           <w:p>
@@ -2801,7 +2801,7 @@
         </w:tc>
         <w:tc>
           <w:tcPr>
-            <w:tcW w:w="4510" w:type="dxa"/>
+            <w:tcW w:w="4509" w:type="dxa"/>
             <w:tcBorders/>
           </w:tcPr>
           <w:p>
@@ -2866,7 +2866,7 @@
         </w:tc>
         <w:tc>
           <w:tcPr>
-            <w:tcW w:w="4510" w:type="dxa"/>
+            <w:tcW w:w="4509" w:type="dxa"/>
             <w:tcBorders/>
           </w:tcPr>
           <w:p>
@@ -2903,6 +2903,7 @@
         <w:rPr>
           <w:rFonts w:ascii="Times New Roman" w:hAnsi="Times New Roman" w:cs="Times New Roman"/>
           <w:i/>
+          <w:i/>
           <w:iCs/>
           <w:sz w:val="24"/>
           <w:szCs w:val="24"/>
@@ -2959,6 +2960,37 @@
       <w:r>
         <w:rPr/>
         <w:t>The CSR block is the only PL module that supports AXI read operations. All registers are memory-mapped and use a fixed 32-bit data width. The module exposes configuration outputs to the dataplane pipeline and receives status inputs from various PL modules.</w:t>
+      </w:r>
+    </w:p>
+    <w:p>
+      <w:pPr>
+        <w:pStyle w:val="NormalWeb"/>
+        <w:spacing w:before="280" w:after="280"/>
+        <w:rPr>
+          <w:rFonts w:ascii="Times New Roman" w:hAnsi="Times New Roman"/>
+          <w:b w:val="false"/>
+          <w:i w:val="false"/>
+          <w:caps w:val="false"/>
+          <w:smallCaps w:val="false"/>
+          <w:color w:val="000000"/>
+          <w:spacing w:val="0"/>
+          <w:sz w:val="24"/>
+          <w:szCs w:val="24"/>
+        </w:rPr>
+      </w:pPr>
+      <w:r>
+        <w:rPr>
+          <w:rFonts w:ascii="Times New Roman" w:hAnsi="Times New Roman"/>
+          <w:b w:val="false"/>
+          <w:i w:val="false"/>
+          <w:caps w:val="false"/>
+          <w:smallCaps w:val="false"/>
+          <w:color w:val="000000"/>
+          <w:spacing w:val="0"/>
+          <w:sz w:val="24"/>
+          <w:szCs w:val="24"/>
+        </w:rPr>
+        <w:t>Only DP_CTRL is reset with the reset signal because it directly controls dataplane behavior and must have a known safe state immediately after reset. Other fields rely on Global Set/Reset (GSR) for initialization to zero at bitstream load - status registers are written by hardware when packets arrive, and DP_CTRL gates dataplane activation, ensuring status registers are not read before valid data exists. This avoids high fanout on the reset net which can cause timing issues.</w:t>
       </w:r>
     </w:p>
     <w:p>
@@ -3339,7 +3371,7 @@
 </file>
 
 <file path=word/header1.xml><?xml version="1.0" encoding="utf-8"?>
-<w:hdr xmlns:o="urn:schemas-microsoft-com:office:office" xmlns:r="http://schemas.openxmlformats.org/officeDocument/2006/relationships" xmlns:v="urn:schemas-microsoft-com:vml" xmlns:w="http://schemas.openxmlformats.org/wordprocessingml/2006/main" xmlns:w10="urn:schemas-microsoft-com:office:word" xmlns:wp="http://schemas.openxmlformats.org/drawingml/2006/wordprocessingDrawing" xmlns:pic="http://schemas.openxmlformats.org/drawingml/2006/picture" xmlns:wps="http://schemas.microsoft.com/office/word/2010/wordprocessingShape" xmlns:wpg="http://schemas.microsoft.com/office/word/2010/wordprocessingGroup" xmlns:mc="http://schemas.openxmlformats.org/markup-compatibility/2006" xmlns:wp14="http://schemas.microsoft.com/office/word/2010/wordprocessingDrawing" xmlns:w14="http://schemas.microsoft.com/office/word/2010/wordml" xmlns:w15="http://schemas.microsoft.com/office/word/2012/wordml" mc:Ignorable="w14 wp14 w15">
+<w:hdr xmlns:o="urn:schemas-microsoft-com:office:office" xmlns:r="http://schemas.openxmlformats.org/officeDocument/2006/relationships" xmlns:v="urn:schemas-microsoft-com:vml" xmlns:w="http://schemas.openxmlformats.org/wordprocessingml/2006/main" xmlns:w10="urn:schemas-microsoft-com:office:word" xmlns:wp="http://schemas.openxmlformats.org/drawingml/2006/wordprocessingDrawing" xmlns:wps="http://schemas.microsoft.com/office/word/2010/wordprocessingShape" xmlns:wpg="http://schemas.microsoft.com/office/word/2010/wordprocessingGroup" xmlns:mc="http://schemas.openxmlformats.org/markup-compatibility/2006" xmlns:wp14="http://schemas.microsoft.com/office/word/2010/wordprocessingDrawing" xmlns:w14="http://schemas.microsoft.com/office/word/2010/wordml" xmlns:w15="http://schemas.microsoft.com/office/word/2012/wordml" mc:Ignorable="w14 wp14 w15">
   <w:p>
     <w:pPr>
       <w:pStyle w:val="Header"/>
@@ -3353,7 +3385,7 @@
 </file>
 
 <file path=word/header2.xml><?xml version="1.0" encoding="utf-8"?>
-<w:hdr xmlns:o="urn:schemas-microsoft-com:office:office" xmlns:r="http://schemas.openxmlformats.org/officeDocument/2006/relationships" xmlns:v="urn:schemas-microsoft-com:vml" xmlns:w="http://schemas.openxmlformats.org/wordprocessingml/2006/main" xmlns:w10="urn:schemas-microsoft-com:office:word" xmlns:wp="http://schemas.openxmlformats.org/drawingml/2006/wordprocessingDrawing" xmlns:pic="http://schemas.openxmlformats.org/drawingml/2006/picture" xmlns:wps="http://schemas.microsoft.com/office/word/2010/wordprocessingShape" xmlns:wpg="http://schemas.microsoft.com/office/word/2010/wordprocessingGroup" xmlns:mc="http://schemas.openxmlformats.org/markup-compatibility/2006" xmlns:wp14="http://schemas.microsoft.com/office/word/2010/wordprocessingDrawing" xmlns:w14="http://schemas.microsoft.com/office/word/2010/wordml" xmlns:w15="http://schemas.microsoft.com/office/word/2012/wordml" mc:Ignorable="w14 wp14 w15">
+<w:hdr xmlns:o="urn:schemas-microsoft-com:office:office" xmlns:r="http://schemas.openxmlformats.org/officeDocument/2006/relationships" xmlns:v="urn:schemas-microsoft-com:vml" xmlns:w="http://schemas.openxmlformats.org/wordprocessingml/2006/main" xmlns:w10="urn:schemas-microsoft-com:office:word" xmlns:wp="http://schemas.openxmlformats.org/drawingml/2006/wordprocessingDrawing" xmlns:wps="http://schemas.microsoft.com/office/word/2010/wordprocessingShape" xmlns:wpg="http://schemas.microsoft.com/office/word/2010/wordprocessingGroup" xmlns:mc="http://schemas.openxmlformats.org/markup-compatibility/2006" xmlns:wp14="http://schemas.microsoft.com/office/word/2010/wordprocessingDrawing" xmlns:w14="http://schemas.microsoft.com/office/word/2010/wordml" xmlns:w15="http://schemas.microsoft.com/office/word/2012/wordml" mc:Ignorable="w14 wp14 w15">
   <w:p>
     <w:pPr>
       <w:pStyle w:val="Normal"/>
@@ -3367,20 +3399,20 @@
     <w:tblPr>
       <w:tblStyle w:val="a1"/>
       <w:tblW w:w="11565" w:type="dxa"/>
-      <w:jc w:val="start"/>
+      <w:jc w:val="left"/>
       <w:tblInd w:w="-1290" w:type="dxa"/>
       <w:tblLayout w:type="fixed"/>
       <w:tblCellMar>
         <w:top w:w="100" w:type="dxa"/>
-        <w:start w:w="100" w:type="dxa"/>
+        <w:left w:w="100" w:type="dxa"/>
         <w:bottom w:w="100" w:type="dxa"/>
-        <w:end w:w="100" w:type="dxa"/>
+        <w:right w:w="100" w:type="dxa"/>
       </w:tblCellMar>
       <w:tblLook w:val="0600" w:noHBand="1" w:noVBand="1" w:firstColumn="0" w:lastRow="0" w:lastColumn="0" w:firstRow="0"/>
     </w:tblPr>
     <w:tblGrid>
       <w:gridCol w:w="5789"/>
-      <w:gridCol w:w="5776"/>
+      <w:gridCol w:w="5775"/>
     </w:tblGrid>
     <w:tr>
       <w:trPr/>
@@ -3389,9 +3421,9 @@
           <w:tcW w:w="5789" w:type="dxa"/>
           <w:tcBorders>
             <w:top w:val="single" w:sz="8" w:space="0" w:color="000000"/>
-            <w:start w:val="single" w:sz="8" w:space="0" w:color="000000"/>
+            <w:left w:val="single" w:sz="8" w:space="0" w:color="000000"/>
             <w:bottom w:val="single" w:sz="8" w:space="0" w:color="000000"/>
-            <w:end w:val="single" w:sz="8" w:space="0" w:color="000000"/>
+            <w:right w:val="single" w:sz="8" w:space="0" w:color="000000"/>
           </w:tcBorders>
         </w:tcPr>
         <w:p>
@@ -3409,12 +3441,12 @@
       </w:tc>
       <w:tc>
         <w:tcPr>
-          <w:tcW w:w="5776" w:type="dxa"/>
+          <w:tcW w:w="5775" w:type="dxa"/>
           <w:tcBorders>
             <w:top w:val="single" w:sz="8" w:space="0" w:color="000000"/>
-            <w:start w:val="single" w:sz="8" w:space="0" w:color="000000"/>
+            <w:left w:val="single" w:sz="8" w:space="0" w:color="000000"/>
             <w:bottom w:val="single" w:sz="8" w:space="0" w:color="000000"/>
-            <w:end w:val="single" w:sz="8" w:space="0" w:color="000000"/>
+            <w:right w:val="single" w:sz="8" w:space="0" w:color="000000"/>
           </w:tcBorders>
         </w:tcPr>
         <w:p>
@@ -3422,7 +3454,7 @@
             <w:pStyle w:val="Normal"/>
             <w:widowControl w:val="false"/>
             <w:spacing w:lineRule="auto" w:line="240"/>
-            <w:jc w:val="end"/>
+            <w:jc w:val="right"/>
             <w:rPr/>
           </w:pPr>
           <w:r>
@@ -3439,9 +3471,9 @@
           <w:tcW w:w="5789" w:type="dxa"/>
           <w:tcBorders>
             <w:top w:val="single" w:sz="8" w:space="0" w:color="000000"/>
-            <w:start w:val="single" w:sz="8" w:space="0" w:color="000000"/>
+            <w:left w:val="single" w:sz="8" w:space="0" w:color="000000"/>
             <w:bottom w:val="single" w:sz="8" w:space="0" w:color="000000"/>
-            <w:end w:val="single" w:sz="8" w:space="0" w:color="000000"/>
+            <w:right w:val="single" w:sz="8" w:space="0" w:color="000000"/>
           </w:tcBorders>
         </w:tcPr>
         <w:p>
@@ -3459,12 +3491,12 @@
       </w:tc>
       <w:tc>
         <w:tcPr>
-          <w:tcW w:w="5776" w:type="dxa"/>
+          <w:tcW w:w="5775" w:type="dxa"/>
           <w:tcBorders>
             <w:top w:val="single" w:sz="8" w:space="0" w:color="000000"/>
-            <w:start w:val="single" w:sz="8" w:space="0" w:color="000000"/>
+            <w:left w:val="single" w:sz="8" w:space="0" w:color="000000"/>
             <w:bottom w:val="single" w:sz="8" w:space="0" w:color="000000"/>
-            <w:end w:val="single" w:sz="8" w:space="0" w:color="000000"/>
+            <w:right w:val="single" w:sz="8" w:space="0" w:color="000000"/>
           </w:tcBorders>
         </w:tcPr>
         <w:p>
@@ -3472,7 +3504,7 @@
             <w:pStyle w:val="Normal"/>
             <w:widowControl w:val="false"/>
             <w:spacing w:lineRule="auto" w:line="240"/>
-            <w:jc w:val="end"/>
+            <w:jc w:val="right"/>
             <w:rPr/>
           </w:pPr>
           <w:r>
@@ -3491,7 +3523,7 @@
     <w:r>
       <w:rPr/>
       <w:drawing>
-        <wp:anchor distT="0" distB="0" distL="0" distR="0" simplePos="0" relativeHeight="11" behindDoc="1" locked="0" layoutInCell="0" allowOverlap="1">
+        <wp:anchor behindDoc="1" distT="0" distB="0" distL="0" distR="0" simplePos="0" locked="0" layoutInCell="0" allowOverlap="1" relativeHeight="10">
           <wp:simplePos x="0" y="0"/>
           <wp:positionH relativeFrom="margin">
             <wp:align>center</wp:align>
@@ -3502,7 +3534,7 @@
           <wp:extent cx="5731510" cy="3820795"/>
           <wp:effectExtent l="0" t="0" r="0" b="0"/>
           <wp:wrapNone/>
-          <wp:docPr id="2" name="WordPictureWatermark1"/>
+          <wp:docPr id="2" name="WordPictureWatermark1" descr=""/>
           <wp:cNvGraphicFramePr>
             <a:graphicFrameLocks xmlns:a="http://schemas.openxmlformats.org/drawingml/2006/main" noChangeAspect="1"/>
           </wp:cNvGraphicFramePr>
@@ -3510,7 +3542,7 @@
             <a:graphicData uri="http://schemas.openxmlformats.org/drawingml/2006/picture">
               <pic:pic xmlns:pic="http://schemas.openxmlformats.org/drawingml/2006/picture">
                 <pic:nvPicPr>
-                  <pic:cNvPr id="2" name="WordPictureWatermark1"/>
+                  <pic:cNvPr id="2" name="WordPictureWatermark1" descr=""/>
                   <pic:cNvPicPr>
                     <a:picLocks noChangeAspect="1" noChangeArrowheads="1"/>
                   </pic:cNvPicPr>
@@ -3531,7 +3563,6 @@
                   <a:prstGeom prst="rect">
                     <a:avLst/>
                   </a:prstGeom>
-                  <a:noFill/>
                 </pic:spPr>
               </pic:pic>
             </a:graphicData>
@@ -3544,7 +3575,7 @@
 </file>
 
 <file path=word/header3.xml><?xml version="1.0" encoding="utf-8"?>
-<w:hdr xmlns:o="urn:schemas-microsoft-com:office:office" xmlns:r="http://schemas.openxmlformats.org/officeDocument/2006/relationships" xmlns:v="urn:schemas-microsoft-com:vml" xmlns:w="http://schemas.openxmlformats.org/wordprocessingml/2006/main" xmlns:w10="urn:schemas-microsoft-com:office:word" xmlns:wp="http://schemas.openxmlformats.org/drawingml/2006/wordprocessingDrawing" xmlns:pic="http://schemas.openxmlformats.org/drawingml/2006/picture" xmlns:wps="http://schemas.microsoft.com/office/word/2010/wordprocessingShape" xmlns:wpg="http://schemas.microsoft.com/office/word/2010/wordprocessingGroup" xmlns:mc="http://schemas.openxmlformats.org/markup-compatibility/2006" xmlns:wp14="http://schemas.microsoft.com/office/word/2010/wordprocessingDrawing" xmlns:w14="http://schemas.microsoft.com/office/word/2010/wordml" xmlns:w15="http://schemas.microsoft.com/office/word/2012/wordml" mc:Ignorable="w14 wp14 w15">
+<w:hdr xmlns:o="urn:schemas-microsoft-com:office:office" xmlns:r="http://schemas.openxmlformats.org/officeDocument/2006/relationships" xmlns:v="urn:schemas-microsoft-com:vml" xmlns:w="http://schemas.openxmlformats.org/wordprocessingml/2006/main" xmlns:w10="urn:schemas-microsoft-com:office:word" xmlns:wp="http://schemas.openxmlformats.org/drawingml/2006/wordprocessingDrawing" xmlns:wps="http://schemas.microsoft.com/office/word/2010/wordprocessingShape" xmlns:wpg="http://schemas.microsoft.com/office/word/2010/wordprocessingGroup" xmlns:mc="http://schemas.openxmlformats.org/markup-compatibility/2006" xmlns:wp14="http://schemas.microsoft.com/office/word/2010/wordprocessingDrawing" xmlns:w14="http://schemas.microsoft.com/office/word/2010/wordml" xmlns:w15="http://schemas.microsoft.com/office/word/2012/wordml" mc:Ignorable="w14 wp14 w15">
   <w:p>
     <w:pPr>
       <w:pStyle w:val="Normal"/>
@@ -3558,20 +3589,20 @@
     <w:tblPr>
       <w:tblStyle w:val="a1"/>
       <w:tblW w:w="11565" w:type="dxa"/>
-      <w:jc w:val="start"/>
+      <w:jc w:val="left"/>
       <w:tblInd w:w="-1290" w:type="dxa"/>
       <w:tblLayout w:type="fixed"/>
       <w:tblCellMar>
         <w:top w:w="100" w:type="dxa"/>
-        <w:start w:w="100" w:type="dxa"/>
+        <w:left w:w="100" w:type="dxa"/>
         <w:bottom w:w="100" w:type="dxa"/>
-        <w:end w:w="100" w:type="dxa"/>
+        <w:right w:w="100" w:type="dxa"/>
       </w:tblCellMar>
       <w:tblLook w:val="0600" w:noHBand="1" w:noVBand="1" w:firstColumn="0" w:lastRow="0" w:lastColumn="0" w:firstRow="0"/>
     </w:tblPr>
     <w:tblGrid>
       <w:gridCol w:w="5789"/>
-      <w:gridCol w:w="5776"/>
+      <w:gridCol w:w="5775"/>
     </w:tblGrid>
     <w:tr>
       <w:trPr/>
@@ -3580,9 +3611,9 @@
           <w:tcW w:w="5789" w:type="dxa"/>
           <w:tcBorders>
             <w:top w:val="single" w:sz="8" w:space="0" w:color="000000"/>
-            <w:start w:val="single" w:sz="8" w:space="0" w:color="000000"/>
+            <w:left w:val="single" w:sz="8" w:space="0" w:color="000000"/>
             <w:bottom w:val="single" w:sz="8" w:space="0" w:color="000000"/>
-            <w:end w:val="single" w:sz="8" w:space="0" w:color="000000"/>
+            <w:right w:val="single" w:sz="8" w:space="0" w:color="000000"/>
           </w:tcBorders>
         </w:tcPr>
         <w:p>
@@ -3600,12 +3631,12 @@
       </w:tc>
       <w:tc>
         <w:tcPr>
-          <w:tcW w:w="5776" w:type="dxa"/>
+          <w:tcW w:w="5775" w:type="dxa"/>
           <w:tcBorders>
             <w:top w:val="single" w:sz="8" w:space="0" w:color="000000"/>
-            <w:start w:val="single" w:sz="8" w:space="0" w:color="000000"/>
+            <w:left w:val="single" w:sz="8" w:space="0" w:color="000000"/>
             <w:bottom w:val="single" w:sz="8" w:space="0" w:color="000000"/>
-            <w:end w:val="single" w:sz="8" w:space="0" w:color="000000"/>
+            <w:right w:val="single" w:sz="8" w:space="0" w:color="000000"/>
           </w:tcBorders>
         </w:tcPr>
         <w:p>
@@ -3613,7 +3644,7 @@
             <w:pStyle w:val="Normal"/>
             <w:widowControl w:val="false"/>
             <w:spacing w:lineRule="auto" w:line="240"/>
-            <w:jc w:val="end"/>
+            <w:jc w:val="right"/>
             <w:rPr/>
           </w:pPr>
           <w:r>
@@ -3630,9 +3661,9 @@
           <w:tcW w:w="5789" w:type="dxa"/>
           <w:tcBorders>
             <w:top w:val="single" w:sz="8" w:space="0" w:color="000000"/>
-            <w:start w:val="single" w:sz="8" w:space="0" w:color="000000"/>
+            <w:left w:val="single" w:sz="8" w:space="0" w:color="000000"/>
             <w:bottom w:val="single" w:sz="8" w:space="0" w:color="000000"/>
-            <w:end w:val="single" w:sz="8" w:space="0" w:color="000000"/>
+            <w:right w:val="single" w:sz="8" w:space="0" w:color="000000"/>
           </w:tcBorders>
         </w:tcPr>
         <w:p>
@@ -3650,12 +3681,12 @@
       </w:tc>
       <w:tc>
         <w:tcPr>
-          <w:tcW w:w="5776" w:type="dxa"/>
+          <w:tcW w:w="5775" w:type="dxa"/>
           <w:tcBorders>
             <w:top w:val="single" w:sz="8" w:space="0" w:color="000000"/>
-            <w:start w:val="single" w:sz="8" w:space="0" w:color="000000"/>
+            <w:left w:val="single" w:sz="8" w:space="0" w:color="000000"/>
             <w:bottom w:val="single" w:sz="8" w:space="0" w:color="000000"/>
-            <w:end w:val="single" w:sz="8" w:space="0" w:color="000000"/>
+            <w:right w:val="single" w:sz="8" w:space="0" w:color="000000"/>
           </w:tcBorders>
         </w:tcPr>
         <w:p>
@@ -3663,7 +3694,7 @@
             <w:pStyle w:val="Normal"/>
             <w:widowControl w:val="false"/>
             <w:spacing w:lineRule="auto" w:line="240"/>
-            <w:jc w:val="end"/>
+            <w:jc w:val="right"/>
             <w:rPr/>
           </w:pPr>
           <w:r>
@@ -3682,7 +3713,7 @@
     <w:r>
       <w:rPr/>
       <w:drawing>
-        <wp:anchor distT="0" distB="0" distL="0" distR="0" simplePos="0" relativeHeight="11" behindDoc="1" locked="0" layoutInCell="0" allowOverlap="1">
+        <wp:anchor behindDoc="1" distT="0" distB="0" distL="0" distR="0" simplePos="0" locked="0" layoutInCell="0" allowOverlap="1" relativeHeight="10">
           <wp:simplePos x="0" y="0"/>
           <wp:positionH relativeFrom="margin">
             <wp:align>center</wp:align>
@@ -3693,7 +3724,7 @@
           <wp:extent cx="5731510" cy="3820795"/>
           <wp:effectExtent l="0" t="0" r="0" b="0"/>
           <wp:wrapNone/>
-          <wp:docPr id="3" name="WordPictureWatermark1"/>
+          <wp:docPr id="3" name="WordPictureWatermark1" descr=""/>
           <wp:cNvGraphicFramePr>
             <a:graphicFrameLocks xmlns:a="http://schemas.openxmlformats.org/drawingml/2006/main" noChangeAspect="1"/>
           </wp:cNvGraphicFramePr>
@@ -3701,7 +3732,7 @@
             <a:graphicData uri="http://schemas.openxmlformats.org/drawingml/2006/picture">
               <pic:pic xmlns:pic="http://schemas.openxmlformats.org/drawingml/2006/picture">
                 <pic:nvPicPr>
-                  <pic:cNvPr id="3" name="WordPictureWatermark1"/>
+                  <pic:cNvPr id="3" name="WordPictureWatermark1" descr=""/>
                   <pic:cNvPicPr>
                     <a:picLocks noChangeAspect="1" noChangeArrowheads="1"/>
                   </pic:cNvPicPr>
@@ -3722,7 +3753,6 @@
                   <a:prstGeom prst="rect">
                     <a:avLst/>
                   </a:prstGeom>
-                  <a:noFill/>
                 </pic:spPr>
               </pic:pic>
             </a:graphicData>
@@ -3739,127 +3769,127 @@
   <w:abstractNum w:abstractNumId="1">
     <w:lvl w:ilvl="0">
       <w:start w:val="1"/>
+      <w:pStyle w:val="Heading1"/>
       <w:numFmt w:val="decimal"/>
-      <w:pStyle w:val="Heading1"/>
       <w:lvlText w:val="%1"/>
-      <w:lvlJc w:val="start"/>
+      <w:lvlJc w:val="left"/>
       <w:pPr>
         <w:tabs>
           <w:tab w:val="num" w:pos="0"/>
         </w:tabs>
-        <w:ind w:start="432" w:hanging="432"/>
+        <w:ind w:left="432" w:hanging="432"/>
       </w:pPr>
       <w:rPr/>
     </w:lvl>
     <w:lvl w:ilvl="1">
       <w:start w:val="1"/>
+      <w:pStyle w:val="Heading2"/>
       <w:numFmt w:val="decimal"/>
-      <w:pStyle w:val="Heading2"/>
       <w:lvlText w:val="%1.%2"/>
-      <w:lvlJc w:val="start"/>
+      <w:lvlJc w:val="left"/>
       <w:pPr>
         <w:tabs>
           <w:tab w:val="num" w:pos="0"/>
         </w:tabs>
-        <w:ind w:start="576" w:hanging="576"/>
+        <w:ind w:left="576" w:hanging="576"/>
       </w:pPr>
       <w:rPr/>
     </w:lvl>
     <w:lvl w:ilvl="2">
       <w:start w:val="1"/>
+      <w:pStyle w:val="Heading3"/>
       <w:numFmt w:val="decimal"/>
-      <w:pStyle w:val="Heading3"/>
       <w:lvlText w:val="%1.%2.%3"/>
-      <w:lvlJc w:val="start"/>
+      <w:lvlJc w:val="left"/>
       <w:pPr>
         <w:tabs>
           <w:tab w:val="num" w:pos="0"/>
         </w:tabs>
-        <w:ind w:start="720" w:hanging="720"/>
+        <w:ind w:left="720" w:hanging="720"/>
       </w:pPr>
       <w:rPr/>
     </w:lvl>
     <w:lvl w:ilvl="3">
       <w:start w:val="1"/>
+      <w:pStyle w:val="Heading4"/>
       <w:numFmt w:val="decimal"/>
-      <w:pStyle w:val="Heading4"/>
       <w:lvlText w:val="%1.%2.%3.%4"/>
-      <w:lvlJc w:val="start"/>
+      <w:lvlJc w:val="left"/>
       <w:pPr>
         <w:tabs>
           <w:tab w:val="num" w:pos="0"/>
         </w:tabs>
-        <w:ind w:start="864" w:hanging="864"/>
+        <w:ind w:left="864" w:hanging="864"/>
       </w:pPr>
       <w:rPr/>
     </w:lvl>
     <w:lvl w:ilvl="4">
       <w:start w:val="1"/>
+      <w:pStyle w:val="Heading5"/>
       <w:numFmt w:val="decimal"/>
-      <w:pStyle w:val="Heading5"/>
       <w:lvlText w:val="%1.%2.%3.%4.%5"/>
-      <w:lvlJc w:val="start"/>
+      <w:lvlJc w:val="left"/>
       <w:pPr>
         <w:tabs>
           <w:tab w:val="num" w:pos="0"/>
         </w:tabs>
-        <w:ind w:start="1008" w:hanging="1008"/>
+        <w:ind w:left="1008" w:hanging="1008"/>
       </w:pPr>
       <w:rPr/>
     </w:lvl>
     <w:lvl w:ilvl="5">
       <w:start w:val="1"/>
+      <w:pStyle w:val="Heading6"/>
       <w:numFmt w:val="decimal"/>
-      <w:pStyle w:val="Heading6"/>
       <w:lvlText w:val="%1.%2.%3.%4.%5.%6"/>
-      <w:lvlJc w:val="start"/>
+      <w:lvlJc w:val="left"/>
       <w:pPr>
         <w:tabs>
           <w:tab w:val="num" w:pos="0"/>
         </w:tabs>
-        <w:ind w:start="1152" w:hanging="1152"/>
+        <w:ind w:left="1152" w:hanging="1152"/>
       </w:pPr>
       <w:rPr/>
     </w:lvl>
     <w:lvl w:ilvl="6">
       <w:start w:val="1"/>
+      <w:pStyle w:val="Heading7"/>
       <w:numFmt w:val="decimal"/>
-      <w:pStyle w:val="Heading7"/>
       <w:lvlText w:val="%1.%2.%3.%4.%5.%6.%7"/>
-      <w:lvlJc w:val="start"/>
+      <w:lvlJc w:val="left"/>
       <w:pPr>
         <w:tabs>
           <w:tab w:val="num" w:pos="0"/>
         </w:tabs>
-        <w:ind w:start="1296" w:hanging="1296"/>
+        <w:ind w:left="1296" w:hanging="1296"/>
       </w:pPr>
       <w:rPr/>
     </w:lvl>
     <w:lvl w:ilvl="7">
       <w:start w:val="1"/>
+      <w:pStyle w:val="Heading8"/>
       <w:numFmt w:val="decimal"/>
-      <w:pStyle w:val="Heading8"/>
       <w:lvlText w:val="%1.%2.%3.%4.%5.%6.%7.%8"/>
-      <w:lvlJc w:val="start"/>
+      <w:lvlJc w:val="left"/>
       <w:pPr>
         <w:tabs>
           <w:tab w:val="num" w:pos="0"/>
         </w:tabs>
-        <w:ind w:start="1440" w:hanging="1440"/>
+        <w:ind w:left="1440" w:hanging="1440"/>
       </w:pPr>
       <w:rPr/>
     </w:lvl>
     <w:lvl w:ilvl="8">
       <w:start w:val="1"/>
+      <w:pStyle w:val="Heading9"/>
       <w:numFmt w:val="decimal"/>
-      <w:pStyle w:val="Heading9"/>
       <w:lvlText w:val="%1.%2.%3.%4.%5.%6.%7.%8.%9"/>
-      <w:lvlJc w:val="start"/>
+      <w:lvlJc w:val="left"/>
       <w:pPr>
         <w:tabs>
           <w:tab w:val="num" w:pos="0"/>
         </w:tabs>
-        <w:ind w:start="1584" w:hanging="1584"/>
+        <w:ind w:left="1584" w:hanging="1584"/>
       </w:pPr>
       <w:rPr/>
     </w:lvl>
@@ -4273,7 +4303,7 @@
       <w:suppressAutoHyphens w:val="true"/>
       <w:bidi w:val="0"/>
       <w:spacing w:lineRule="auto" w:line="276" w:before="0" w:after="0"/>
-      <w:jc w:val="start"/>
+      <w:jc w:val="left"/>
     </w:pPr>
     <w:rPr>
       <w:rFonts w:ascii="Arial" w:hAnsi="Arial" w:eastAsia="Arial" w:cs="Arial"/>
@@ -4285,7 +4315,7 @@
     </w:rPr>
   </w:style>
   <w:style w:type="paragraph" w:styleId="Heading1">
-    <w:name w:val="heading 1"/>
+    <w:name w:val="Heading 1"/>
     <w:basedOn w:val="Normal"/>
     <w:next w:val="Normal"/>
     <w:uiPriority w:val="9"/>
@@ -4306,7 +4336,7 @@
     </w:rPr>
   </w:style>
   <w:style w:type="paragraph" w:styleId="Heading2">
-    <w:name w:val="heading 2"/>
+    <w:name w:val="Heading 2"/>
     <w:basedOn w:val="Normal"/>
     <w:next w:val="Normal"/>
     <w:link w:val="Otsikko2Char"/>
@@ -4329,7 +4359,7 @@
     </w:rPr>
   </w:style>
   <w:style w:type="paragraph" w:styleId="Heading3">
-    <w:name w:val="heading 3"/>
+    <w:name w:val="Heading 3"/>
     <w:basedOn w:val="Normal"/>
     <w:next w:val="Normal"/>
     <w:link w:val="Otsikko3Char"/>
@@ -4353,7 +4383,7 @@
     </w:rPr>
   </w:style>
   <w:style w:type="paragraph" w:styleId="Heading4">
-    <w:name w:val="heading 4"/>
+    <w:name w:val="Heading 4"/>
     <w:basedOn w:val="Normal"/>
     <w:next w:val="Normal"/>
     <w:uiPriority w:val="9"/>
@@ -4376,7 +4406,7 @@
     </w:rPr>
   </w:style>
   <w:style w:type="paragraph" w:styleId="Heading5">
-    <w:name w:val="heading 5"/>
+    <w:name w:val="Heading 5"/>
     <w:basedOn w:val="Normal"/>
     <w:next w:val="Normal"/>
     <w:uiPriority w:val="9"/>
@@ -4398,7 +4428,7 @@
     </w:rPr>
   </w:style>
   <w:style w:type="paragraph" w:styleId="Heading6">
-    <w:name w:val="heading 6"/>
+    <w:name w:val="Heading 6"/>
     <w:basedOn w:val="Normal"/>
     <w:next w:val="Normal"/>
     <w:uiPriority w:val="9"/>
@@ -4422,7 +4452,7 @@
     </w:rPr>
   </w:style>
   <w:style w:type="paragraph" w:styleId="Heading7">
-    <w:name w:val="heading 7"/>
+    <w:name w:val="Heading 7"/>
     <w:basedOn w:val="Normal"/>
     <w:next w:val="Normal"/>
     <w:link w:val="Otsikko7Char"/>
@@ -4449,7 +4479,7 @@
     </w:rPr>
   </w:style>
   <w:style w:type="paragraph" w:styleId="Heading8">
-    <w:name w:val="heading 8"/>
+    <w:name w:val="Heading 8"/>
     <w:basedOn w:val="Normal"/>
     <w:next w:val="Normal"/>
     <w:link w:val="Otsikko8Char"/>
@@ -4476,7 +4506,7 @@
     </w:rPr>
   </w:style>
   <w:style w:type="paragraph" w:styleId="Heading9">
-    <w:name w:val="heading 9"/>
+    <w:name w:val="Heading 9"/>
     <w:basedOn w:val="Normal"/>
     <w:next w:val="Normal"/>
     <w:link w:val="Otsikko9Char"/>
@@ -4649,7 +4679,7 @@
     </w:rPr>
   </w:style>
   <w:style w:type="paragraph" w:styleId="Caption">
-    <w:name w:val="caption"/>
+    <w:name w:val="Caption"/>
     <w:basedOn w:val="Normal"/>
     <w:qFormat/>
     <w:pPr>
@@ -4709,7 +4739,7 @@
     </w:rPr>
   </w:style>
   <w:style w:type="paragraph" w:styleId="IndexHeading">
-    <w:name w:val="index heading"/>
+    <w:name w:val="Index Heading"/>
     <w:basedOn w:val="Heading"/>
     <w:pPr/>
     <w:rPr/>
@@ -4739,7 +4769,7 @@
     </w:rPr>
   </w:style>
   <w:style w:type="paragraph" w:styleId="TOC1">
-    <w:name w:val="toc 1"/>
+    <w:name w:val="TOC 1"/>
     <w:basedOn w:val="Normal"/>
     <w:next w:val="Normal"/>
     <w:autoRedefine/>
@@ -4752,7 +4782,7 @@
     <w:rPr/>
   </w:style>
   <w:style w:type="paragraph" w:styleId="TOC2">
-    <w:name w:val="toc 2"/>
+    <w:name w:val="TOC 2"/>
     <w:basedOn w:val="Normal"/>
     <w:next w:val="Normal"/>
     <w:autoRedefine/>
@@ -4761,12 +4791,12 @@
     <w:rsid w:val="008c18e9"/>
     <w:pPr>
       <w:spacing w:before="0" w:after="100"/>
-      <w:ind w:start="220"/>
+      <w:ind w:left="220"/>
     </w:pPr>
     <w:rPr/>
   </w:style>
   <w:style w:type="paragraph" w:styleId="TOC3">
-    <w:name w:val="toc 3"/>
+    <w:name w:val="TOC 3"/>
     <w:basedOn w:val="Normal"/>
     <w:next w:val="Normal"/>
     <w:autoRedefine/>
@@ -4775,7 +4805,7 @@
     <w:rsid w:val="008c18e9"/>
     <w:pPr>
       <w:spacing w:before="0" w:after="100"/>
-      <w:ind w:start="440"/>
+      <w:ind w:left="440"/>
     </w:pPr>
     <w:rPr/>
   </w:style>
@@ -4787,7 +4817,7 @@
     <w:rPr/>
   </w:style>
   <w:style w:type="paragraph" w:styleId="Header">
-    <w:name w:val="header"/>
+    <w:name w:val="Header"/>
     <w:basedOn w:val="Normal"/>
     <w:link w:val="YltunnisteChar"/>
     <w:uiPriority w:val="99"/>
@@ -4804,7 +4834,7 @@
     <w:rPr/>
   </w:style>
   <w:style w:type="paragraph" w:styleId="Footer">
-    <w:name w:val="footer"/>
+    <w:name w:val="Footer"/>
     <w:basedOn w:val="Normal"/>
     <w:link w:val="AlatunnisteChar"/>
     <w:uiPriority w:val="99"/>
@@ -4845,43 +4875,43 @@
     <w:rsid w:val="005d2bb4"/>
     <w:pPr>
       <w:spacing w:before="0" w:after="0"/>
-      <w:ind w:start="720"/>
+      <w:ind w:left="720"/>
       <w:contextualSpacing/>
     </w:pPr>
     <w:rPr/>
   </w:style>
   <w:style w:type="paragraph" w:styleId="TOC4">
-    <w:name w:val="toc 4"/>
+    <w:name w:val="TOC 4"/>
     <w:basedOn w:val="Index"/>
     <w:pPr/>
     <w:rPr/>
   </w:style>
   <w:style w:type="paragraph" w:styleId="TOC5">
-    <w:name w:val="toc 5"/>
+    <w:name w:val="TOC 5"/>
     <w:basedOn w:val="Index"/>
     <w:pPr/>
     <w:rPr/>
   </w:style>
   <w:style w:type="paragraph" w:styleId="TOC6">
-    <w:name w:val="toc 6"/>
+    <w:name w:val="TOC 6"/>
     <w:basedOn w:val="Index"/>
     <w:pPr/>
     <w:rPr/>
   </w:style>
   <w:style w:type="paragraph" w:styleId="TOC7">
-    <w:name w:val="toc 7"/>
+    <w:name w:val="TOC 7"/>
     <w:basedOn w:val="Index"/>
     <w:pPr/>
     <w:rPr/>
   </w:style>
   <w:style w:type="paragraph" w:styleId="TOC8">
-    <w:name w:val="toc 8"/>
+    <w:name w:val="TOC 8"/>
     <w:basedOn w:val="Index"/>
     <w:pPr/>
     <w:rPr/>
   </w:style>
   <w:style w:type="paragraph" w:styleId="TOC9">
-    <w:name w:val="toc 9"/>
+    <w:name w:val="TOC 9"/>
     <w:basedOn w:val="Index"/>
     <w:pPr/>
     <w:rPr/>
@@ -4948,34 +4978,34 @@
         <a:srgbClr val="000000"/>
       </a:dk1>
       <a:lt1>
-        <a:srgbClr val="FFFFFF"/>
+        <a:srgbClr val="ffffff"/>
       </a:lt1>
       <a:dk2>
-        <a:srgbClr val="1F497D"/>
+        <a:srgbClr val="1f497d"/>
       </a:dk2>
       <a:lt2>
-        <a:srgbClr val="EEECE1"/>
+        <a:srgbClr val="eeece1"/>
       </a:lt2>
       <a:accent1>
-        <a:srgbClr val="4F81BD"/>
+        <a:srgbClr val="4f81bd"/>
       </a:accent1>
       <a:accent2>
-        <a:srgbClr val="C0504D"/>
+        <a:srgbClr val="c0504d"/>
       </a:accent2>
       <a:accent3>
-        <a:srgbClr val="9BBB59"/>
+        <a:srgbClr val="9bbb59"/>
       </a:accent3>
       <a:accent4>
-        <a:srgbClr val="8064A2"/>
+        <a:srgbClr val="8064a2"/>
       </a:accent4>
       <a:accent5>
-        <a:srgbClr val="4BACC6"/>
+        <a:srgbClr val="4bacc6"/>
       </a:accent5>
       <a:accent6>
-        <a:srgbClr val="F79646"/>
+        <a:srgbClr val="f79646"/>
       </a:accent6>
       <a:hlink>
-        <a:srgbClr val="0000FF"/>
+        <a:srgbClr val="0000ff"/>
       </a:hlink>
       <a:folHlink>
         <a:srgbClr val="800080"/>

</xml_diff>

<commit_message>
updates to verification flow + action stage RTL + DP_CTRL signals
</commit_message>
<xml_diff>
--- a/docs/Zynq Networking Dataplane Specifications.docx
+++ b/docs/Zynq Networking Dataplane Specifications.docx
@@ -2232,7 +2232,9 @@
         </w:rPr>
       </w:pPr>
       <w:r>
-        <w:rPr/>
+        <w:rPr>
+          <w:rFonts w:cs="Times New Roman" w:ascii="Times New Roman" w:hAnsi="Times New Roman"/>
+        </w:rPr>
         <w:drawing>
           <wp:anchor behindDoc="0" distT="0" distB="0" distL="0" distR="0" simplePos="0" locked="0" layoutInCell="0" allowOverlap="1" relativeHeight="11">
             <wp:simplePos x="0" y="0"/>
@@ -2385,87 +2387,59 @@
           <w:bCs w:val="false"/>
           <w:lang w:val="en-US"/>
         </w:rPr>
-        <w:t xml:space="preserve">- </w:t>
-      </w:r>
-      <w:r>
+        <w:t>- Include dataplane control fiels: enable, loopback, flow_table_flush (self-clearing), default_action, irq_enable, stats_clear (self-clearing)</w:t>
+      </w:r>
+    </w:p>
+    <w:p>
+      <w:pPr>
+        <w:pStyle w:val="Normal"/>
         <w:rPr>
           <w:b w:val="false"/>
           <w:bCs w:val="false"/>
           <w:lang w:val="en-US"/>
         </w:rPr>
-        <w:t>Include dataplane control fiels: enable, loopback, flow_table_flush (self-clearing), default_action, irq_enable, stats_clear (self-clearing)</w:t>
-      </w:r>
-    </w:p>
-    <w:p>
-      <w:pPr>
-        <w:pStyle w:val="Normal"/>
+      </w:pPr>
+      <w:r>
         <w:rPr>
           <w:b w:val="false"/>
           <w:bCs w:val="false"/>
           <w:lang w:val="en-US"/>
         </w:rPr>
-      </w:pPr>
-      <w:r>
+        <w:t>- Action stages modify phase should be aware what section of header is on going to correctly modify destination mac address and source mac address fields. This could be done with either header signal and simple counter or SOP signal and header bit counter</w:t>
+      </w:r>
+    </w:p>
+    <w:p>
+      <w:pPr>
+        <w:pStyle w:val="Normal"/>
         <w:rPr>
           <w:b w:val="false"/>
           <w:bCs w:val="false"/>
           <w:lang w:val="en-US"/>
         </w:rPr>
-        <w:t>- Action stages modify phase should be aware what section of header is on going to correctly modify destination mac address and source mac address fields. This could be done with either header signal and simple counter or SOP signal and header bit counter</w:t>
-      </w:r>
-    </w:p>
-    <w:p>
-      <w:pPr>
-        <w:pStyle w:val="Normal"/>
+      </w:pPr>
+      <w:r>
         <w:rPr>
           <w:b w:val="false"/>
           <w:bCs w:val="false"/>
           <w:lang w:val="en-US"/>
         </w:rPr>
-      </w:pPr>
+        <w:t xml:space="preserve">- Xilinx recommends using synchronous active-high resets with FPGA’s. Active-low requires an inverter </w:t>
+      </w:r>
       <w:r>
         <w:rPr>
           <w:b w:val="false"/>
           <w:bCs w:val="false"/>
           <w:lang w:val="en-US"/>
         </w:rPr>
-        <w:t>- BRAM tables shouldn’t use reset signal also CSR doesn’t need reset since all of these are controleld by PS (we can initate all of the registers before enabling dataplane)</w:t>
-      </w:r>
-    </w:p>
-    <w:p>
-      <w:pPr>
-        <w:pStyle w:val="Normal"/>
+        <w:t>w</w:t>
+      </w:r>
+      <w:r>
         <w:rPr>
           <w:b w:val="false"/>
           <w:bCs w:val="false"/>
           <w:lang w:val="en-US"/>
         </w:rPr>
-      </w:pPr>
-      <w:r>
-        <w:rPr>
-          <w:b w:val="false"/>
-          <w:bCs w:val="false"/>
-          <w:lang w:val="en-US"/>
-        </w:rPr>
-        <w:t>- We should adda dp_start set/clear CSR that enables the dataplane (can be used for example after all of the tables / CSR’s have been initialized)</w:t>
-      </w:r>
-    </w:p>
-    <w:p>
-      <w:pPr>
-        <w:pStyle w:val="Normal"/>
-        <w:rPr>
-          <w:b w:val="false"/>
-          <w:bCs w:val="false"/>
-          <w:lang w:val="en-US"/>
-        </w:rPr>
-      </w:pPr>
-      <w:r>
-        <w:rPr>
-          <w:b w:val="false"/>
-          <w:bCs w:val="false"/>
-          <w:lang w:val="en-US"/>
-        </w:rPr>
-        <w:t xml:space="preserve">- Xilinx recommends using synchronous active-high resets with FPGA’s. Active-low requires an inverter chich can be absorbed into the register or add an extra logic level to the path </w:t>
+        <w:t xml:space="preserve">hich can be absorbed into the register or add an extra logic level to the path </w:t>
       </w:r>
     </w:p>
     <w:p>
@@ -3105,6 +3079,7 @@
           <w:rFonts w:ascii="Times New Roman" w:hAnsi="Times New Roman"/>
           <w:b w:val="false"/>
           <w:i w:val="false"/>
+          <w:i w:val="false"/>
           <w:caps w:val="false"/>
           <w:smallCaps w:val="false"/>
           <w:color w:val="000000"/>
@@ -3115,7 +3090,6 @@
       </w:pPr>
       <w:r>
         <w:rPr>
-          <w:rFonts w:ascii="Times New Roman" w:hAnsi="Times New Roman"/>
           <w:b w:val="false"/>
           <w:i w:val="false"/>
           <w:caps w:val="false"/>
@@ -3620,23 +3594,7 @@
           </w:pPr>
           <w:r>
             <w:rPr/>
-            <w:t>Date: 0</w:t>
-          </w:r>
-          <w:r>
-            <w:rPr/>
-            <w:t>5</w:t>
-          </w:r>
-          <w:r>
-            <w:rPr/>
-            <w:t>/</w:t>
-          </w:r>
-          <w:r>
-            <w:rPr/>
-            <w:t>10</w:t>
-          </w:r>
-          <w:r>
-            <w:rPr/>
-            <w:t>/2026</w:t>
+            <w:t>Date: 05/10/2026</w:t>
           </w:r>
         </w:p>
       </w:tc>
@@ -3660,11 +3618,7 @@
           </w:pPr>
           <w:r>
             <w:rPr/>
-            <w:t>Version: 1.</w:t>
-          </w:r>
-          <w:r>
-            <w:rPr/>
-            <w:t>2</w:t>
+            <w:t>Version: 1.2</w:t>
           </w:r>
         </w:p>
       </w:tc>
@@ -3830,23 +3784,7 @@
           </w:pPr>
           <w:r>
             <w:rPr/>
-            <w:t>Date: 0</w:t>
-          </w:r>
-          <w:r>
-            <w:rPr/>
-            <w:t>5</w:t>
-          </w:r>
-          <w:r>
-            <w:rPr/>
-            <w:t>/</w:t>
-          </w:r>
-          <w:r>
-            <w:rPr/>
-            <w:t>10</w:t>
-          </w:r>
-          <w:r>
-            <w:rPr/>
-            <w:t>/2026</w:t>
+            <w:t>Date: 05/10/2026</w:t>
           </w:r>
         </w:p>
       </w:tc>
@@ -3870,11 +3808,7 @@
           </w:pPr>
           <w:r>
             <w:rPr/>
-            <w:t>Version: 1.</w:t>
-          </w:r>
-          <w:r>
-            <w:rPr/>
-            <w:t>2</w:t>
+            <w:t>Version: 1.2</w:t>
           </w:r>
         </w:p>
       </w:tc>

</xml_diff>

<commit_message>
architectural updates + BD
</commit_message>
<xml_diff>
--- a/docs/Zynq Networking Dataplane Specifications.docx
+++ b/docs/Zynq Networking Dataplane Specifications.docx
@@ -1,6 +1,6 @@
 
 <file path=word/document.xml><?xml version="1.0" encoding="utf-8"?>
-<w:document xmlns:o="urn:schemas-microsoft-com:office:office" xmlns:r="http://schemas.openxmlformats.org/officeDocument/2006/relationships" xmlns:v="urn:schemas-microsoft-com:vml" xmlns:w="http://schemas.openxmlformats.org/wordprocessingml/2006/main" xmlns:w10="urn:schemas-microsoft-com:office:word" xmlns:wp="http://schemas.openxmlformats.org/drawingml/2006/wordprocessingDrawing" xmlns:wps="http://schemas.microsoft.com/office/word/2010/wordprocessingShape" xmlns:wpg="http://schemas.microsoft.com/office/word/2010/wordprocessingGroup" xmlns:mc="http://schemas.openxmlformats.org/markup-compatibility/2006" xmlns:wp14="http://schemas.microsoft.com/office/word/2010/wordprocessingDrawing" xmlns:w14="http://schemas.microsoft.com/office/word/2010/wordml" xmlns:w15="http://schemas.microsoft.com/office/word/2012/wordml" mc:Ignorable="w14 wp14 w15">
+<w:document xmlns:o="urn:schemas-microsoft-com:office:office" xmlns:r="http://schemas.openxmlformats.org/officeDocument/2006/relationships" xmlns:v="urn:schemas-microsoft-com:vml" xmlns:w="http://schemas.openxmlformats.org/wordprocessingml/2006/main" xmlns:w10="urn:schemas-microsoft-com:office:word" xmlns:wp="http://schemas.openxmlformats.org/drawingml/2006/wordprocessingDrawing" xmlns:pic="http://schemas.openxmlformats.org/drawingml/2006/picture" xmlns:wps="http://schemas.microsoft.com/office/word/2010/wordprocessingShape" xmlns:wpg="http://schemas.microsoft.com/office/word/2010/wordprocessingGroup" xmlns:mc="http://schemas.openxmlformats.org/markup-compatibility/2006" xmlns:wp14="http://schemas.microsoft.com/office/word/2010/wordprocessingDrawing" xmlns:w14="http://schemas.microsoft.com/office/word/2010/wordml" xmlns:w15="http://schemas.microsoft.com/office/word/2012/wordml" mc:Ignorable="w14 wp14 w15">
   <w:body>
     <w:p>
       <w:pPr>
@@ -170,7 +170,7 @@
         <w:gridCol w:w="2258"/>
         <w:gridCol w:w="2257"/>
         <w:gridCol w:w="2256"/>
-        <w:gridCol w:w="2257"/>
+        <w:gridCol w:w="2258"/>
       </w:tblGrid>
       <w:tr>
         <w:trPr/>
@@ -290,7 +290,7 @@
         </w:tc>
         <w:tc>
           <w:tcPr>
-            <w:tcW w:w="2257" w:type="dxa"/>
+            <w:tcW w:w="2258" w:type="dxa"/>
             <w:tcBorders>
               <w:top w:val="single" w:sz="8" w:space="0" w:color="000000"/>
               <w:left w:val="single" w:sz="8" w:space="0" w:color="000000"/>
@@ -427,7 +427,7 @@
         </w:tc>
         <w:tc>
           <w:tcPr>
-            <w:tcW w:w="2257" w:type="dxa"/>
+            <w:tcW w:w="2258" w:type="dxa"/>
             <w:tcBorders>
               <w:top w:val="single" w:sz="8" w:space="0" w:color="000000"/>
               <w:left w:val="single" w:sz="8" w:space="0" w:color="000000"/>
@@ -558,7 +558,7 @@
         </w:tc>
         <w:tc>
           <w:tcPr>
-            <w:tcW w:w="2257" w:type="dxa"/>
+            <w:tcW w:w="2258" w:type="dxa"/>
             <w:tcBorders>
               <w:top w:val="single" w:sz="8" w:space="0" w:color="000000"/>
               <w:left w:val="single" w:sz="8" w:space="0" w:color="000000"/>
@@ -686,7 +686,7 @@
         </w:tc>
         <w:tc>
           <w:tcPr>
-            <w:tcW w:w="2257" w:type="dxa"/>
+            <w:tcW w:w="2258" w:type="dxa"/>
             <w:tcBorders>
               <w:left w:val="single" w:sz="8" w:space="0" w:color="000000"/>
               <w:bottom w:val="single" w:sz="8" w:space="0" w:color="000000"/>
@@ -860,18 +860,18 @@
           </w:r>
           <w:r>
             <w:rPr>
-              <w:webHidden/>
               <w:rStyle w:val="IndexLink"/>
               <w:vanish w:val="false"/>
+              <w:webHidden/>
               <w:lang w:val="en-US"/>
             </w:rPr>
             <w:instrText xml:space="preserve"> TOC \z \o "1-3" \u \h</w:instrText>
           </w:r>
           <w:r>
             <w:rPr>
-              <w:webHidden/>
               <w:rStyle w:val="IndexLink"/>
               <w:vanish w:val="false"/>
+              <w:webHidden/>
               <w:lang w:val="en-US"/>
             </w:rPr>
             <w:fldChar w:fldCharType="separate"/>
@@ -879,9 +879,9 @@
           <w:hyperlink w:anchor="_Toc221458742">
             <w:r>
               <w:rPr>
-                <w:webHidden/>
                 <w:rStyle w:val="IndexLink"/>
                 <w:vanish w:val="false"/>
+                <w:webHidden/>
                 <w:lang w:val="en-US"/>
               </w:rPr>
               <w:t>2</w:t>
@@ -959,9 +959,9 @@
           <w:hyperlink w:anchor="_Toc221458743">
             <w:r>
               <w:rPr>
-                <w:webHidden/>
                 <w:rStyle w:val="IndexLink"/>
                 <w:vanish w:val="false"/>
+                <w:webHidden/>
               </w:rPr>
               <w:t>3</w:t>
             </w:r>
@@ -1037,9 +1037,9 @@
           <w:hyperlink w:anchor="_Toc221458744">
             <w:r>
               <w:rPr>
-                <w:webHidden/>
                 <w:rStyle w:val="IndexLink"/>
                 <w:vanish w:val="false"/>
+                <w:webHidden/>
               </w:rPr>
               <w:t>3.1</w:t>
             </w:r>
@@ -1115,10 +1115,10 @@
           <w:hyperlink w:anchor="_Toc221458745">
             <w:r>
               <w:rPr>
-                <w:webHidden/>
                 <w:rStyle w:val="IndexLink"/>
                 <w:rFonts w:cs="Times New Roman" w:ascii="Times New Roman" w:hAnsi="Times New Roman"/>
                 <w:vanish w:val="false"/>
+                <w:webHidden/>
               </w:rPr>
               <w:t>3.1.1</w:t>
             </w:r>
@@ -1195,10 +1195,10 @@
           <w:hyperlink w:anchor="_Toc221458746">
             <w:r>
               <w:rPr>
-                <w:webHidden/>
                 <w:rStyle w:val="IndexLink"/>
                 <w:rFonts w:cs="Times New Roman" w:ascii="Times New Roman" w:hAnsi="Times New Roman"/>
                 <w:vanish w:val="false"/>
+                <w:webHidden/>
                 <w:lang w:val="en-US"/>
               </w:rPr>
               <w:t>3.1.2</w:t>
@@ -1277,10 +1277,10 @@
           <w:hyperlink w:anchor="_Toc221458747">
             <w:r>
               <w:rPr>
-                <w:webHidden/>
                 <w:rStyle w:val="IndexLink"/>
                 <w:rFonts w:cs="Times New Roman" w:ascii="Times New Roman" w:hAnsi="Times New Roman"/>
                 <w:vanish w:val="false"/>
+                <w:webHidden/>
                 <w:lang w:val="en-US"/>
               </w:rPr>
               <w:t>3.1.3</w:t>
@@ -1359,10 +1359,10 @@
           <w:hyperlink w:anchor="_Toc221458748">
             <w:r>
               <w:rPr>
-                <w:webHidden/>
                 <w:rStyle w:val="IndexLink"/>
                 <w:rFonts w:cs="Times New Roman" w:ascii="Times New Roman" w:hAnsi="Times New Roman"/>
                 <w:vanish w:val="false"/>
+                <w:webHidden/>
               </w:rPr>
               <w:t>3.1.4</w:t>
             </w:r>
@@ -1439,10 +1439,10 @@
           <w:hyperlink w:anchor="_Toc221458749">
             <w:r>
               <w:rPr>
-                <w:webHidden/>
                 <w:rStyle w:val="IndexLink"/>
                 <w:rFonts w:cs="Times New Roman" w:ascii="Times New Roman" w:hAnsi="Times New Roman"/>
                 <w:vanish w:val="false"/>
+                <w:webHidden/>
                 <w:lang w:val="en-US"/>
               </w:rPr>
               <w:t>3.1.5</w:t>
@@ -1521,10 +1521,10 @@
           <w:hyperlink w:anchor="_Toc221458750">
             <w:r>
               <w:rPr>
-                <w:webHidden/>
                 <w:rStyle w:val="IndexLink"/>
                 <w:rFonts w:cs="Times New Roman" w:ascii="Times New Roman" w:hAnsi="Times New Roman"/>
                 <w:vanish w:val="false"/>
+                <w:webHidden/>
                 <w:lang w:val="en-US"/>
               </w:rPr>
               <w:t>3.1.6</w:t>
@@ -1603,10 +1603,10 @@
           <w:hyperlink w:anchor="_Toc221458751">
             <w:r>
               <w:rPr>
-                <w:webHidden/>
                 <w:rStyle w:val="IndexLink"/>
                 <w:rFonts w:cs="Times New Roman" w:ascii="Times New Roman" w:hAnsi="Times New Roman"/>
                 <w:vanish w:val="false"/>
+                <w:webHidden/>
                 <w:lang w:val="en-US"/>
               </w:rPr>
               <w:t>3.1.7</w:t>
@@ -1685,10 +1685,10 @@
           <w:hyperlink w:anchor="_Toc221458752">
             <w:r>
               <w:rPr>
-                <w:webHidden/>
                 <w:rStyle w:val="IndexLink"/>
                 <w:rFonts w:cs="Times New Roman" w:ascii="Times New Roman" w:hAnsi="Times New Roman"/>
                 <w:vanish w:val="false"/>
+                <w:webHidden/>
                 <w:lang w:val="en-US"/>
               </w:rPr>
               <w:t>3.1.8</w:t>
@@ -1767,10 +1767,10 @@
           <w:hyperlink w:anchor="_Toc221458753">
             <w:r>
               <w:rPr>
-                <w:webHidden/>
                 <w:rStyle w:val="IndexLink"/>
                 <w:rFonts w:cs="Times New Roman" w:ascii="Times New Roman" w:hAnsi="Times New Roman"/>
                 <w:vanish w:val="false"/>
+                <w:webHidden/>
                 <w:lang w:val="en-US"/>
               </w:rPr>
               <w:t>3.1.9</w:t>
@@ -1849,10 +1849,10 @@
           <w:hyperlink w:anchor="_Toc221458754">
             <w:r>
               <w:rPr>
-                <w:webHidden/>
                 <w:rStyle w:val="IndexLink"/>
                 <w:rFonts w:cs="Times New Roman" w:ascii="Times New Roman" w:hAnsi="Times New Roman"/>
                 <w:vanish w:val="false"/>
+                <w:webHidden/>
                 <w:lang w:val="en-US"/>
               </w:rPr>
               <w:t>3.1.10</w:t>
@@ -1931,10 +1931,10 @@
           <w:hyperlink w:anchor="_Toc221458755">
             <w:r>
               <w:rPr>
-                <w:webHidden/>
                 <w:rStyle w:val="IndexLink"/>
                 <w:rFonts w:cs="Times New Roman" w:ascii="Times New Roman" w:hAnsi="Times New Roman"/>
                 <w:vanish w:val="false"/>
+                <w:webHidden/>
                 <w:lang w:val="en-US"/>
               </w:rPr>
               <w:t>3.1.11</w:t>
@@ -2214,13 +2214,11 @@
         <w:pStyle w:val="Normal"/>
         <w:rPr>
           <w:rFonts w:ascii="Times New Roman" w:hAnsi="Times New Roman" w:cs="Times New Roman"/>
-          <w:lang w:val="en-US"/>
         </w:rPr>
       </w:pPr>
       <w:r>
         <w:rPr>
           <w:rFonts w:cs="Times New Roman" w:ascii="Times New Roman" w:hAnsi="Times New Roman"/>
-          <w:lang w:val="en-US"/>
         </w:rPr>
       </w:r>
     </w:p>
@@ -2229,14 +2227,18 @@
         <w:pStyle w:val="Normal"/>
         <w:rPr>
           <w:rFonts w:ascii="Times New Roman" w:hAnsi="Times New Roman" w:cs="Times New Roman"/>
+          <w:i/>
+          <w:iCs/>
         </w:rPr>
       </w:pPr>
       <w:r>
         <w:rPr>
           <w:rFonts w:cs="Times New Roman" w:ascii="Times New Roman" w:hAnsi="Times New Roman"/>
+          <w:i/>
+          <w:iCs/>
         </w:rPr>
         <w:drawing>
-          <wp:anchor behindDoc="0" distT="0" distB="0" distL="0" distR="0" simplePos="0" locked="0" layoutInCell="0" allowOverlap="1" relativeHeight="11">
+          <wp:anchor distT="0" distB="0" distL="0" distR="0" simplePos="0" relativeHeight="11" behindDoc="0" locked="0" layoutInCell="0" allowOverlap="1">
             <wp:simplePos x="0" y="0"/>
             <wp:positionH relativeFrom="column">
               <wp:align>center</wp:align>
@@ -2244,10 +2246,10 @@
             <wp:positionV relativeFrom="paragraph">
               <wp:posOffset>635</wp:posOffset>
             </wp:positionV>
-            <wp:extent cx="5842635" cy="4069715"/>
+            <wp:extent cx="5731510" cy="3992245"/>
             <wp:effectExtent l="0" t="0" r="0" b="0"/>
             <wp:wrapSquare wrapText="largest"/>
-            <wp:docPr id="1" name="Image1" descr=""/>
+            <wp:docPr id="1" name="Image1"/>
             <wp:cNvGraphicFramePr>
               <a:graphicFrameLocks xmlns:a="http://schemas.openxmlformats.org/drawingml/2006/main" noChangeAspect="1"/>
             </wp:cNvGraphicFramePr>
@@ -2255,7 +2257,7 @@
               <a:graphicData uri="http://schemas.openxmlformats.org/drawingml/2006/picture">
                 <pic:pic xmlns:pic="http://schemas.openxmlformats.org/drawingml/2006/picture">
                   <pic:nvPicPr>
-                    <pic:cNvPr id="1" name="Image1" descr=""/>
+                    <pic:cNvPr id="1" name="Image1"/>
                     <pic:cNvPicPr>
                       <a:picLocks noChangeAspect="1" noChangeArrowheads="1"/>
                     </pic:cNvPicPr>
@@ -2269,11 +2271,12 @@
                   <pic:spPr bwMode="auto">
                     <a:xfrm>
                       <a:off x="0" y="0"/>
-                      <a:ext cx="5842635" cy="4069715"/>
+                      <a:ext cx="5731510" cy="3992245"/>
                     </a:xfrm>
                     <a:prstGeom prst="rect">
                       <a:avLst/>
                     </a:prstGeom>
+                    <a:noFill/>
                   </pic:spPr>
                 </pic:pic>
               </a:graphicData>
@@ -2281,17 +2284,6 @@
           </wp:anchor>
         </w:drawing>
       </w:r>
-    </w:p>
-    <w:p>
-      <w:pPr>
-        <w:pStyle w:val="Normal"/>
-        <w:rPr>
-          <w:rFonts w:ascii="Times New Roman" w:hAnsi="Times New Roman" w:cs="Times New Roman"/>
-          <w:i/>
-          <w:i/>
-          <w:iCs/>
-        </w:rPr>
-      </w:pPr>
       <w:r>
         <w:rPr>
           <w:rFonts w:cs="Times New Roman" w:ascii="Times New Roman" w:hAnsi="Times New Roman"/>
@@ -2423,23 +2415,25 @@
           <w:bCs w:val="false"/>
           <w:lang w:val="en-US"/>
         </w:rPr>
-        <w:t xml:space="preserve">- Xilinx recommends using synchronous active-high resets with FPGA’s. Active-low requires an inverter </w:t>
-      </w:r>
-      <w:r>
+        <w:t xml:space="preserve">- Xilinx recommends using synchronous active-high resets with FPGA’s. Active-low requires an inverter which can be absorbed into the register or add an extra logic level to the path </w:t>
+      </w:r>
+    </w:p>
+    <w:p>
+      <w:pPr>
+        <w:pStyle w:val="Normal"/>
         <w:rPr>
           <w:b w:val="false"/>
           <w:bCs w:val="false"/>
           <w:lang w:val="en-US"/>
         </w:rPr>
-        <w:t>w</w:t>
-      </w:r>
+      </w:pPr>
       <w:r>
         <w:rPr>
           <w:b w:val="false"/>
           <w:bCs w:val="false"/>
           <w:lang w:val="en-US"/>
         </w:rPr>
-        <w:t xml:space="preserve">hich can be absorbed into the register or add an extra logic level to the path </w:t>
+        <w:t>- make sure action stage modify endian is correct and also that after modifying the upcoming data is not old headers and if there are tkeep other than ‘1 then we need to add logic that sets data accordingly, currently we expect that the header comes with tkeep ‘1 format but it can have holes and then the old headers and data get corrupt. Outgoing tkeep shouldn’t be altered like it is currently.</w:t>
       </w:r>
     </w:p>
     <w:p>
@@ -2457,7 +2451,7 @@
           <w:bCs w:val="false"/>
           <w:lang w:val="en-US"/>
         </w:rPr>
-        <w:t>- make sure action stage modify endian is correct and also that after modifying the upcoming data is not old headers and if there are tkeep other than ‘1 then we need to add logic that sets data accordingly, currently we expect that the header comes with tkeep ‘1 format but it can have holes and then the old headers and data get corrupt. Outgoing tkeep shouldn’t be altered like it is currently.</w:t>
+        <w:t>- Explore race conditions and hash mapping</w:t>
       </w:r>
     </w:p>
     <w:p>
@@ -2475,7 +2469,15 @@
           <w:bCs w:val="false"/>
           <w:lang w:val="en-US"/>
         </w:rPr>
-        <w:t>- Explore race conditions and hash mapping</w:t>
+        <w:t xml:space="preserve">- </w:t>
+      </w:r>
+      <w:r>
+        <w:rPr>
+          <w:b w:val="false"/>
+          <w:bCs w:val="false"/>
+          <w:lang w:val="en-US"/>
+        </w:rPr>
+        <w:t>We could punt flow miss packets to PS via DMA, then we run a small AI model with acceleration done on FPGA fabric via DMA, then we make a decision for flow table so we know what to do with the packet next time.</w:t>
       </w:r>
       <w:r>
         <w:br w:type="page"/>
@@ -2733,7 +2735,7 @@
       </w:tblPr>
       <w:tblGrid>
         <w:gridCol w:w="4509"/>
-        <w:gridCol w:w="4509"/>
+        <w:gridCol w:w="4510"/>
       </w:tblGrid>
       <w:tr>
         <w:trPr/>
@@ -2775,7 +2777,7 @@
         </w:tc>
         <w:tc>
           <w:tcPr>
-            <w:tcW w:w="4509" w:type="dxa"/>
+            <w:tcW w:w="4510" w:type="dxa"/>
             <w:tcBorders/>
             <w:shd w:color="auto" w:fill="C6D9F1" w:themeFill="text2" w:themeFillTint="33" w:val="clear"/>
           </w:tcPr>
@@ -2845,7 +2847,7 @@
         </w:tc>
         <w:tc>
           <w:tcPr>
-            <w:tcW w:w="4509" w:type="dxa"/>
+            <w:tcW w:w="4510" w:type="dxa"/>
             <w:tcBorders/>
           </w:tcPr>
           <w:p>
@@ -2910,7 +2912,7 @@
         </w:tc>
         <w:tc>
           <w:tcPr>
-            <w:tcW w:w="4509" w:type="dxa"/>
+            <w:tcW w:w="4510" w:type="dxa"/>
             <w:tcBorders/>
           </w:tcPr>
           <w:p>
@@ -2975,7 +2977,7 @@
         </w:tc>
         <w:tc>
           <w:tcPr>
-            <w:tcW w:w="4509" w:type="dxa"/>
+            <w:tcW w:w="4510" w:type="dxa"/>
             <w:tcBorders/>
           </w:tcPr>
           <w:p>
@@ -3012,7 +3014,6 @@
         <w:rPr>
           <w:rFonts w:ascii="Times New Roman" w:hAnsi="Times New Roman" w:cs="Times New Roman"/>
           <w:i/>
-          <w:i/>
           <w:iCs/>
           <w:sz w:val="24"/>
           <w:szCs w:val="24"/>
@@ -3078,7 +3079,6 @@
         <w:rPr>
           <w:rFonts w:ascii="Times New Roman" w:hAnsi="Times New Roman"/>
           <w:b w:val="false"/>
-          <w:i w:val="false"/>
           <w:i w:val="false"/>
           <w:caps w:val="false"/>
           <w:smallCaps w:val="false"/>
@@ -3480,7 +3480,7 @@
 </file>
 
 <file path=word/header1.xml><?xml version="1.0" encoding="utf-8"?>
-<w:hdr xmlns:o="urn:schemas-microsoft-com:office:office" xmlns:r="http://schemas.openxmlformats.org/officeDocument/2006/relationships" xmlns:v="urn:schemas-microsoft-com:vml" xmlns:w="http://schemas.openxmlformats.org/wordprocessingml/2006/main" xmlns:w10="urn:schemas-microsoft-com:office:word" xmlns:wp="http://schemas.openxmlformats.org/drawingml/2006/wordprocessingDrawing" xmlns:wps="http://schemas.microsoft.com/office/word/2010/wordprocessingShape" xmlns:wpg="http://schemas.microsoft.com/office/word/2010/wordprocessingGroup" xmlns:mc="http://schemas.openxmlformats.org/markup-compatibility/2006" xmlns:wp14="http://schemas.microsoft.com/office/word/2010/wordprocessingDrawing" xmlns:w14="http://schemas.microsoft.com/office/word/2010/wordml" xmlns:w15="http://schemas.microsoft.com/office/word/2012/wordml" mc:Ignorable="w14 wp14 w15">
+<w:hdr xmlns:o="urn:schemas-microsoft-com:office:office" xmlns:r="http://schemas.openxmlformats.org/officeDocument/2006/relationships" xmlns:v="urn:schemas-microsoft-com:vml" xmlns:w="http://schemas.openxmlformats.org/wordprocessingml/2006/main" xmlns:w10="urn:schemas-microsoft-com:office:word" xmlns:wp="http://schemas.openxmlformats.org/drawingml/2006/wordprocessingDrawing" xmlns:pic="http://schemas.openxmlformats.org/drawingml/2006/picture" xmlns:wps="http://schemas.microsoft.com/office/word/2010/wordprocessingShape" xmlns:wpg="http://schemas.microsoft.com/office/word/2010/wordprocessingGroup" xmlns:mc="http://schemas.openxmlformats.org/markup-compatibility/2006" xmlns:wp14="http://schemas.microsoft.com/office/word/2010/wordprocessingDrawing" xmlns:w14="http://schemas.microsoft.com/office/word/2010/wordml" xmlns:w15="http://schemas.microsoft.com/office/word/2012/wordml" mc:Ignorable="w14 wp14 w15">
   <w:p>
     <w:pPr>
       <w:pStyle w:val="Header"/>
@@ -3494,7 +3494,7 @@
 </file>
 
 <file path=word/header2.xml><?xml version="1.0" encoding="utf-8"?>
-<w:hdr xmlns:o="urn:schemas-microsoft-com:office:office" xmlns:r="http://schemas.openxmlformats.org/officeDocument/2006/relationships" xmlns:v="urn:schemas-microsoft-com:vml" xmlns:w="http://schemas.openxmlformats.org/wordprocessingml/2006/main" xmlns:w10="urn:schemas-microsoft-com:office:word" xmlns:wp="http://schemas.openxmlformats.org/drawingml/2006/wordprocessingDrawing" xmlns:wps="http://schemas.microsoft.com/office/word/2010/wordprocessingShape" xmlns:wpg="http://schemas.microsoft.com/office/word/2010/wordprocessingGroup" xmlns:mc="http://schemas.openxmlformats.org/markup-compatibility/2006" xmlns:wp14="http://schemas.microsoft.com/office/word/2010/wordprocessingDrawing" xmlns:w14="http://schemas.microsoft.com/office/word/2010/wordml" xmlns:w15="http://schemas.microsoft.com/office/word/2012/wordml" mc:Ignorable="w14 wp14 w15">
+<w:hdr xmlns:o="urn:schemas-microsoft-com:office:office" xmlns:r="http://schemas.openxmlformats.org/officeDocument/2006/relationships" xmlns:v="urn:schemas-microsoft-com:vml" xmlns:w="http://schemas.openxmlformats.org/wordprocessingml/2006/main" xmlns:w10="urn:schemas-microsoft-com:office:word" xmlns:wp="http://schemas.openxmlformats.org/drawingml/2006/wordprocessingDrawing" xmlns:pic="http://schemas.openxmlformats.org/drawingml/2006/picture" xmlns:wps="http://schemas.microsoft.com/office/word/2010/wordprocessingShape" xmlns:wpg="http://schemas.microsoft.com/office/word/2010/wordprocessingGroup" xmlns:mc="http://schemas.openxmlformats.org/markup-compatibility/2006" xmlns:wp14="http://schemas.microsoft.com/office/word/2010/wordprocessingDrawing" xmlns:w14="http://schemas.microsoft.com/office/word/2010/wordml" xmlns:w15="http://schemas.microsoft.com/office/word/2012/wordml" mc:Ignorable="w14 wp14 w15">
   <w:p>
     <w:pPr>
       <w:pStyle w:val="Normal"/>
@@ -3521,7 +3521,7 @@
     </w:tblPr>
     <w:tblGrid>
       <w:gridCol w:w="5789"/>
-      <w:gridCol w:w="5775"/>
+      <w:gridCol w:w="5776"/>
     </w:tblGrid>
     <w:tr>
       <w:trPr/>
@@ -3550,7 +3550,7 @@
       </w:tc>
       <w:tc>
         <w:tcPr>
-          <w:tcW w:w="5775" w:type="dxa"/>
+          <w:tcW w:w="5776" w:type="dxa"/>
           <w:tcBorders>
             <w:top w:val="single" w:sz="8" w:space="0" w:color="000000"/>
             <w:left w:val="single" w:sz="8" w:space="0" w:color="000000"/>
@@ -3600,7 +3600,7 @@
       </w:tc>
       <w:tc>
         <w:tcPr>
-          <w:tcW w:w="5775" w:type="dxa"/>
+          <w:tcW w:w="5776" w:type="dxa"/>
           <w:tcBorders>
             <w:top w:val="single" w:sz="8" w:space="0" w:color="000000"/>
             <w:left w:val="single" w:sz="8" w:space="0" w:color="000000"/>
@@ -3632,7 +3632,7 @@
     <w:r>
       <w:rPr/>
       <w:drawing>
-        <wp:anchor behindDoc="1" distT="0" distB="0" distL="0" distR="0" simplePos="0" locked="0" layoutInCell="0" allowOverlap="1" relativeHeight="10">
+        <wp:anchor distT="0" distB="0" distL="0" distR="0" simplePos="0" relativeHeight="10" behindDoc="1" locked="0" layoutInCell="0" allowOverlap="1">
           <wp:simplePos x="0" y="0"/>
           <wp:positionH relativeFrom="margin">
             <wp:align>center</wp:align>
@@ -3643,7 +3643,7 @@
           <wp:extent cx="5731510" cy="3820795"/>
           <wp:effectExtent l="0" t="0" r="0" b="0"/>
           <wp:wrapNone/>
-          <wp:docPr id="2" name="WordPictureWatermark1" descr=""/>
+          <wp:docPr id="2" name="WordPictureWatermark1"/>
           <wp:cNvGraphicFramePr>
             <a:graphicFrameLocks xmlns:a="http://schemas.openxmlformats.org/drawingml/2006/main" noChangeAspect="1"/>
           </wp:cNvGraphicFramePr>
@@ -3651,7 +3651,7 @@
             <a:graphicData uri="http://schemas.openxmlformats.org/drawingml/2006/picture">
               <pic:pic xmlns:pic="http://schemas.openxmlformats.org/drawingml/2006/picture">
                 <pic:nvPicPr>
-                  <pic:cNvPr id="2" name="WordPictureWatermark1" descr=""/>
+                  <pic:cNvPr id="2" name="WordPictureWatermark1"/>
                   <pic:cNvPicPr>
                     <a:picLocks noChangeAspect="1" noChangeArrowheads="1"/>
                   </pic:cNvPicPr>
@@ -3672,6 +3672,7 @@
                   <a:prstGeom prst="rect">
                     <a:avLst/>
                   </a:prstGeom>
+                  <a:noFill/>
                 </pic:spPr>
               </pic:pic>
             </a:graphicData>
@@ -3684,7 +3685,7 @@
 </file>
 
 <file path=word/header3.xml><?xml version="1.0" encoding="utf-8"?>
-<w:hdr xmlns:o="urn:schemas-microsoft-com:office:office" xmlns:r="http://schemas.openxmlformats.org/officeDocument/2006/relationships" xmlns:v="urn:schemas-microsoft-com:vml" xmlns:w="http://schemas.openxmlformats.org/wordprocessingml/2006/main" xmlns:w10="urn:schemas-microsoft-com:office:word" xmlns:wp="http://schemas.openxmlformats.org/drawingml/2006/wordprocessingDrawing" xmlns:wps="http://schemas.microsoft.com/office/word/2010/wordprocessingShape" xmlns:wpg="http://schemas.microsoft.com/office/word/2010/wordprocessingGroup" xmlns:mc="http://schemas.openxmlformats.org/markup-compatibility/2006" xmlns:wp14="http://schemas.microsoft.com/office/word/2010/wordprocessingDrawing" xmlns:w14="http://schemas.microsoft.com/office/word/2010/wordml" xmlns:w15="http://schemas.microsoft.com/office/word/2012/wordml" mc:Ignorable="w14 wp14 w15">
+<w:hdr xmlns:o="urn:schemas-microsoft-com:office:office" xmlns:r="http://schemas.openxmlformats.org/officeDocument/2006/relationships" xmlns:v="urn:schemas-microsoft-com:vml" xmlns:w="http://schemas.openxmlformats.org/wordprocessingml/2006/main" xmlns:w10="urn:schemas-microsoft-com:office:word" xmlns:wp="http://schemas.openxmlformats.org/drawingml/2006/wordprocessingDrawing" xmlns:pic="http://schemas.openxmlformats.org/drawingml/2006/picture" xmlns:wps="http://schemas.microsoft.com/office/word/2010/wordprocessingShape" xmlns:wpg="http://schemas.microsoft.com/office/word/2010/wordprocessingGroup" xmlns:mc="http://schemas.openxmlformats.org/markup-compatibility/2006" xmlns:wp14="http://schemas.microsoft.com/office/word/2010/wordprocessingDrawing" xmlns:w14="http://schemas.microsoft.com/office/word/2010/wordml" xmlns:w15="http://schemas.microsoft.com/office/word/2012/wordml" mc:Ignorable="w14 wp14 w15">
   <w:p>
     <w:pPr>
       <w:pStyle w:val="Normal"/>
@@ -3711,7 +3712,7 @@
     </w:tblPr>
     <w:tblGrid>
       <w:gridCol w:w="5789"/>
-      <w:gridCol w:w="5775"/>
+      <w:gridCol w:w="5776"/>
     </w:tblGrid>
     <w:tr>
       <w:trPr/>
@@ -3740,7 +3741,7 @@
       </w:tc>
       <w:tc>
         <w:tcPr>
-          <w:tcW w:w="5775" w:type="dxa"/>
+          <w:tcW w:w="5776" w:type="dxa"/>
           <w:tcBorders>
             <w:top w:val="single" w:sz="8" w:space="0" w:color="000000"/>
             <w:left w:val="single" w:sz="8" w:space="0" w:color="000000"/>
@@ -3790,7 +3791,7 @@
       </w:tc>
       <w:tc>
         <w:tcPr>
-          <w:tcW w:w="5775" w:type="dxa"/>
+          <w:tcW w:w="5776" w:type="dxa"/>
           <w:tcBorders>
             <w:top w:val="single" w:sz="8" w:space="0" w:color="000000"/>
             <w:left w:val="single" w:sz="8" w:space="0" w:color="000000"/>
@@ -3822,7 +3823,7 @@
     <w:r>
       <w:rPr/>
       <w:drawing>
-        <wp:anchor behindDoc="1" distT="0" distB="0" distL="0" distR="0" simplePos="0" locked="0" layoutInCell="0" allowOverlap="1" relativeHeight="10">
+        <wp:anchor distT="0" distB="0" distL="0" distR="0" simplePos="0" relativeHeight="10" behindDoc="1" locked="0" layoutInCell="0" allowOverlap="1">
           <wp:simplePos x="0" y="0"/>
           <wp:positionH relativeFrom="margin">
             <wp:align>center</wp:align>
@@ -3833,7 +3834,7 @@
           <wp:extent cx="5731510" cy="3820795"/>
           <wp:effectExtent l="0" t="0" r="0" b="0"/>
           <wp:wrapNone/>
-          <wp:docPr id="3" name="WordPictureWatermark1" descr=""/>
+          <wp:docPr id="3" name="WordPictureWatermark1"/>
           <wp:cNvGraphicFramePr>
             <a:graphicFrameLocks xmlns:a="http://schemas.openxmlformats.org/drawingml/2006/main" noChangeAspect="1"/>
           </wp:cNvGraphicFramePr>
@@ -3841,7 +3842,7 @@
             <a:graphicData uri="http://schemas.openxmlformats.org/drawingml/2006/picture">
               <pic:pic xmlns:pic="http://schemas.openxmlformats.org/drawingml/2006/picture">
                 <pic:nvPicPr>
-                  <pic:cNvPr id="3" name="WordPictureWatermark1" descr=""/>
+                  <pic:cNvPr id="3" name="WordPictureWatermark1"/>
                   <pic:cNvPicPr>
                     <a:picLocks noChangeAspect="1" noChangeArrowheads="1"/>
                   </pic:cNvPicPr>
@@ -3862,6 +3863,7 @@
                   <a:prstGeom prst="rect">
                     <a:avLst/>
                   </a:prstGeom>
+                  <a:noFill/>
                 </pic:spPr>
               </pic:pic>
             </a:graphicData>
@@ -3878,8 +3880,8 @@
   <w:abstractNum w:abstractNumId="1">
     <w:lvl w:ilvl="0">
       <w:start w:val="1"/>
+      <w:numFmt w:val="decimal"/>
       <w:pStyle w:val="Heading1"/>
-      <w:numFmt w:val="decimal"/>
       <w:lvlText w:val="%1"/>
       <w:lvlJc w:val="left"/>
       <w:pPr>
@@ -3892,8 +3894,8 @@
     </w:lvl>
     <w:lvl w:ilvl="1">
       <w:start w:val="1"/>
+      <w:numFmt w:val="decimal"/>
       <w:pStyle w:val="Heading2"/>
-      <w:numFmt w:val="decimal"/>
       <w:lvlText w:val="%1.%2"/>
       <w:lvlJc w:val="left"/>
       <w:pPr>
@@ -3906,8 +3908,8 @@
     </w:lvl>
     <w:lvl w:ilvl="2">
       <w:start w:val="1"/>
+      <w:numFmt w:val="decimal"/>
       <w:pStyle w:val="Heading3"/>
-      <w:numFmt w:val="decimal"/>
       <w:lvlText w:val="%1.%2.%3"/>
       <w:lvlJc w:val="left"/>
       <w:pPr>
@@ -3920,8 +3922,8 @@
     </w:lvl>
     <w:lvl w:ilvl="3">
       <w:start w:val="1"/>
+      <w:numFmt w:val="decimal"/>
       <w:pStyle w:val="Heading4"/>
-      <w:numFmt w:val="decimal"/>
       <w:lvlText w:val="%1.%2.%3.%4"/>
       <w:lvlJc w:val="left"/>
       <w:pPr>
@@ -3934,8 +3936,8 @@
     </w:lvl>
     <w:lvl w:ilvl="4">
       <w:start w:val="1"/>
+      <w:numFmt w:val="decimal"/>
       <w:pStyle w:val="Heading5"/>
-      <w:numFmt w:val="decimal"/>
       <w:lvlText w:val="%1.%2.%3.%4.%5"/>
       <w:lvlJc w:val="left"/>
       <w:pPr>
@@ -3948,8 +3950,8 @@
     </w:lvl>
     <w:lvl w:ilvl="5">
       <w:start w:val="1"/>
+      <w:numFmt w:val="decimal"/>
       <w:pStyle w:val="Heading6"/>
-      <w:numFmt w:val="decimal"/>
       <w:lvlText w:val="%1.%2.%3.%4.%5.%6"/>
       <w:lvlJc w:val="left"/>
       <w:pPr>
@@ -3962,8 +3964,8 @@
     </w:lvl>
     <w:lvl w:ilvl="6">
       <w:start w:val="1"/>
+      <w:numFmt w:val="decimal"/>
       <w:pStyle w:val="Heading7"/>
-      <w:numFmt w:val="decimal"/>
       <w:lvlText w:val="%1.%2.%3.%4.%5.%6.%7"/>
       <w:lvlJc w:val="left"/>
       <w:pPr>
@@ -3976,8 +3978,8 @@
     </w:lvl>
     <w:lvl w:ilvl="7">
       <w:start w:val="1"/>
+      <w:numFmt w:val="decimal"/>
       <w:pStyle w:val="Heading8"/>
-      <w:numFmt w:val="decimal"/>
       <w:lvlText w:val="%1.%2.%3.%4.%5.%6.%7.%8"/>
       <w:lvlJc w:val="left"/>
       <w:pPr>
@@ -3990,8 +3992,8 @@
     </w:lvl>
     <w:lvl w:ilvl="8">
       <w:start w:val="1"/>
+      <w:numFmt w:val="decimal"/>
       <w:pStyle w:val="Heading9"/>
-      <w:numFmt w:val="decimal"/>
       <w:lvlText w:val="%1.%2.%3.%4.%5.%6.%7.%8.%9"/>
       <w:lvlJc w:val="left"/>
       <w:pPr>
@@ -4424,7 +4426,7 @@
     </w:rPr>
   </w:style>
   <w:style w:type="paragraph" w:styleId="Heading1">
-    <w:name w:val="Heading 1"/>
+    <w:name w:val="heading 1"/>
     <w:basedOn w:val="Normal"/>
     <w:next w:val="Normal"/>
     <w:uiPriority w:val="9"/>
@@ -4445,7 +4447,7 @@
     </w:rPr>
   </w:style>
   <w:style w:type="paragraph" w:styleId="Heading2">
-    <w:name w:val="Heading 2"/>
+    <w:name w:val="heading 2"/>
     <w:basedOn w:val="Normal"/>
     <w:next w:val="Normal"/>
     <w:link w:val="Otsikko2Char"/>
@@ -4468,7 +4470,7 @@
     </w:rPr>
   </w:style>
   <w:style w:type="paragraph" w:styleId="Heading3">
-    <w:name w:val="Heading 3"/>
+    <w:name w:val="heading 3"/>
     <w:basedOn w:val="Normal"/>
     <w:next w:val="Normal"/>
     <w:link w:val="Otsikko3Char"/>
@@ -4492,7 +4494,7 @@
     </w:rPr>
   </w:style>
   <w:style w:type="paragraph" w:styleId="Heading4">
-    <w:name w:val="Heading 4"/>
+    <w:name w:val="heading 4"/>
     <w:basedOn w:val="Normal"/>
     <w:next w:val="Normal"/>
     <w:uiPriority w:val="9"/>
@@ -4515,7 +4517,7 @@
     </w:rPr>
   </w:style>
   <w:style w:type="paragraph" w:styleId="Heading5">
-    <w:name w:val="Heading 5"/>
+    <w:name w:val="heading 5"/>
     <w:basedOn w:val="Normal"/>
     <w:next w:val="Normal"/>
     <w:uiPriority w:val="9"/>
@@ -4537,7 +4539,7 @@
     </w:rPr>
   </w:style>
   <w:style w:type="paragraph" w:styleId="Heading6">
-    <w:name w:val="Heading 6"/>
+    <w:name w:val="heading 6"/>
     <w:basedOn w:val="Normal"/>
     <w:next w:val="Normal"/>
     <w:uiPriority w:val="9"/>
@@ -4561,7 +4563,7 @@
     </w:rPr>
   </w:style>
   <w:style w:type="paragraph" w:styleId="Heading7">
-    <w:name w:val="Heading 7"/>
+    <w:name w:val="heading 7"/>
     <w:basedOn w:val="Normal"/>
     <w:next w:val="Normal"/>
     <w:link w:val="Otsikko7Char"/>
@@ -4588,7 +4590,7 @@
     </w:rPr>
   </w:style>
   <w:style w:type="paragraph" w:styleId="Heading8">
-    <w:name w:val="Heading 8"/>
+    <w:name w:val="heading 8"/>
     <w:basedOn w:val="Normal"/>
     <w:next w:val="Normal"/>
     <w:link w:val="Otsikko8Char"/>
@@ -4615,7 +4617,7 @@
     </w:rPr>
   </w:style>
   <w:style w:type="paragraph" w:styleId="Heading9">
-    <w:name w:val="Heading 9"/>
+    <w:name w:val="heading 9"/>
     <w:basedOn w:val="Normal"/>
     <w:next w:val="Normal"/>
     <w:link w:val="Otsikko9Char"/>
@@ -4788,7 +4790,7 @@
     </w:rPr>
   </w:style>
   <w:style w:type="paragraph" w:styleId="Caption">
-    <w:name w:val="Caption"/>
+    <w:name w:val="caption"/>
     <w:basedOn w:val="Normal"/>
     <w:qFormat/>
     <w:pPr>
@@ -4848,7 +4850,7 @@
     </w:rPr>
   </w:style>
   <w:style w:type="paragraph" w:styleId="IndexHeading">
-    <w:name w:val="Index Heading"/>
+    <w:name w:val="index heading"/>
     <w:basedOn w:val="Heading"/>
     <w:pPr/>
     <w:rPr/>
@@ -4878,7 +4880,7 @@
     </w:rPr>
   </w:style>
   <w:style w:type="paragraph" w:styleId="TOC1">
-    <w:name w:val="TOC 1"/>
+    <w:name w:val="toc 1"/>
     <w:basedOn w:val="Normal"/>
     <w:next w:val="Normal"/>
     <w:autoRedefine/>
@@ -4891,7 +4893,7 @@
     <w:rPr/>
   </w:style>
   <w:style w:type="paragraph" w:styleId="TOC2">
-    <w:name w:val="TOC 2"/>
+    <w:name w:val="toc 2"/>
     <w:basedOn w:val="Normal"/>
     <w:next w:val="Normal"/>
     <w:autoRedefine/>
@@ -4905,7 +4907,7 @@
     <w:rPr/>
   </w:style>
   <w:style w:type="paragraph" w:styleId="TOC3">
-    <w:name w:val="TOC 3"/>
+    <w:name w:val="toc 3"/>
     <w:basedOn w:val="Normal"/>
     <w:next w:val="Normal"/>
     <w:autoRedefine/>
@@ -4926,7 +4928,7 @@
     <w:rPr/>
   </w:style>
   <w:style w:type="paragraph" w:styleId="Header">
-    <w:name w:val="Header"/>
+    <w:name w:val="header"/>
     <w:basedOn w:val="Normal"/>
     <w:link w:val="YltunnisteChar"/>
     <w:uiPriority w:val="99"/>
@@ -4943,7 +4945,7 @@
     <w:rPr/>
   </w:style>
   <w:style w:type="paragraph" w:styleId="Footer">
-    <w:name w:val="Footer"/>
+    <w:name w:val="footer"/>
     <w:basedOn w:val="Normal"/>
     <w:link w:val="AlatunnisteChar"/>
     <w:uiPriority w:val="99"/>
@@ -4990,37 +4992,37 @@
     <w:rPr/>
   </w:style>
   <w:style w:type="paragraph" w:styleId="TOC4">
-    <w:name w:val="TOC 4"/>
+    <w:name w:val="toc 4"/>
     <w:basedOn w:val="Index"/>
     <w:pPr/>
     <w:rPr/>
   </w:style>
   <w:style w:type="paragraph" w:styleId="TOC5">
-    <w:name w:val="TOC 5"/>
+    <w:name w:val="toc 5"/>
     <w:basedOn w:val="Index"/>
     <w:pPr/>
     <w:rPr/>
   </w:style>
   <w:style w:type="paragraph" w:styleId="TOC6">
-    <w:name w:val="TOC 6"/>
+    <w:name w:val="toc 6"/>
     <w:basedOn w:val="Index"/>
     <w:pPr/>
     <w:rPr/>
   </w:style>
   <w:style w:type="paragraph" w:styleId="TOC7">
-    <w:name w:val="TOC 7"/>
+    <w:name w:val="toc 7"/>
     <w:basedOn w:val="Index"/>
     <w:pPr/>
     <w:rPr/>
   </w:style>
   <w:style w:type="paragraph" w:styleId="TOC8">
-    <w:name w:val="TOC 8"/>
+    <w:name w:val="toc 8"/>
     <w:basedOn w:val="Index"/>
     <w:pPr/>
     <w:rPr/>
   </w:style>
   <w:style w:type="paragraph" w:styleId="TOC9">
-    <w:name w:val="TOC 9"/>
+    <w:name w:val="toc 9"/>
     <w:basedOn w:val="Index"/>
     <w:pPr/>
     <w:rPr/>
@@ -5087,34 +5089,34 @@
         <a:srgbClr val="000000"/>
       </a:dk1>
       <a:lt1>
-        <a:srgbClr val="ffffff"/>
+        <a:srgbClr val="FFFFFF"/>
       </a:lt1>
       <a:dk2>
-        <a:srgbClr val="1f497d"/>
+        <a:srgbClr val="1F497D"/>
       </a:dk2>
       <a:lt2>
-        <a:srgbClr val="eeece1"/>
+        <a:srgbClr val="EEECE1"/>
       </a:lt2>
       <a:accent1>
-        <a:srgbClr val="4f81bd"/>
+        <a:srgbClr val="4F81BD"/>
       </a:accent1>
       <a:accent2>
-        <a:srgbClr val="c0504d"/>
+        <a:srgbClr val="C0504D"/>
       </a:accent2>
       <a:accent3>
-        <a:srgbClr val="9bbb59"/>
+        <a:srgbClr val="9BBB59"/>
       </a:accent3>
       <a:accent4>
-        <a:srgbClr val="8064a2"/>
+        <a:srgbClr val="8064A2"/>
       </a:accent4>
       <a:accent5>
-        <a:srgbClr val="4bacc6"/>
+        <a:srgbClr val="4BACC6"/>
       </a:accent5>
       <a:accent6>
-        <a:srgbClr val="f79646"/>
+        <a:srgbClr val="F79646"/>
       </a:accent6>
       <a:hlink>
-        <a:srgbClr val="0000ff"/>
+        <a:srgbClr val="0000FF"/>
       </a:hlink>
       <a:folHlink>
         <a:srgbClr val="800080"/>

</xml_diff>